<commit_message>
docs: rewrite illustrated Word guide with memory architecture
Replace the tutorial with an 11-page guide covering installation, projects, personal and project memory, backup, rollover, and troubleshooting. Include nine cropped operation screenshots and a code-derived architecture diagram with editable SVG source. Validate all rendered pages using Word PDF export and check DOCX structure and SVG XML.
</commit_message>
<xml_diff>
--- a/tutorial/DeepSeek-Pilot使用教程.docx
+++ b/tutorial/DeepSeek-Pilot使用教程.docx
@@ -5,130 +5,41 @@
     <w:p>
       <w:pPr>
         <w:pStyle w:val="Title"/>
+        <w:snapToGrid w:val="0"/>
       </w:pPr>
       <w:r>
         <w:t>DeepSeek Pilot 使用教程</w:t>
       </w:r>
     </w:p>
     <w:p>
+      <w:pPr>
+        <w:pStyle w:val="Subtitle"/>
+        <w:snapToGrid w:val="0"/>
+      </w:pPr>
       <w:r>
-        <w:t>从导入加载到项目和记忆管理</w:t>
+        <w:t>适用版本 0.9.0    更新日期 2026年10月26日</w:t>
       </w:r>
     </w:p>
     <w:p>
+      <w:pPr>
+        <w:snapToGrid w:val="0"/>
+      </w:pPr>
       <w:r>
-        <w:t>适用版本 0.9.0  |  更新日期 2026年10月23日</w:t>
+        <w:t>本插件为 DeepSeek 网页版提供项目管理、跨会话记忆和长对话接续。先了解下图，再按后续步骤完成安装、建立项目和首次记忆验证。</w:t>
       </w:r>
     </w:p>
     <w:p>
-      <w:r>
-        <w:t>本教程帮助首次使用者安装浏览器扩展，创建项目，在聊天时带入记忆，并完成记忆备份与迁移。按顺序完成安装，再用一个新会话体验完整流程。</w:t>
-      </w:r>
-    </w:p>
-    <w:p>
-      <w:pPr>
-        <w:pStyle w:val="Heading2"/>
-      </w:pPr>
-      <w:r>
-        <w:t>开始前准备</w:t>
-      </w:r>
-    </w:p>
-    <w:p>
-      <w:r>
-        <w:t>准备 Chrome 浏览器和解压后的插件源码。Firefox 用户见第 2 页。插件无需编译，无需另外配置模型 API key；正式使用需要可用的 DeepSeek 账号与网络。</w:t>
-      </w:r>
-    </w:p>
-    <w:p>
-      <w:r>
-        <w:t>源码下载：https://github.com/5J-5J/DeepSeek-Pilot</w:t>
-        <w:br/>
-        <w:t>网页入口：https://chat.deepseek.com/</w:t>
-      </w:r>
-    </w:p>
-    <w:p>
-      <w:pPr>
-        <w:pStyle w:val="Heading2"/>
-      </w:pPr>
-      <w:r>
-        <w:t>教程导航</w:t>
-      </w:r>
-    </w:p>
-    <w:p>
-      <w:r>
-        <w:t>第 2 页  导入和加载插件</w:t>
-        <w:br/>
-        <w:t>第 3 页  创建项目和开始聊天</w:t>
-        <w:br/>
-        <w:t>第 4 页  设置和长对话接续</w:t>
-        <w:br/>
-        <w:t>第 5 页  查看编辑及导入导出记忆</w:t>
-        <w:br/>
-        <w:t>第 6 页  更新插件和排查问题</w:t>
-      </w:r>
-    </w:p>
-    <w:p>
-      <w:pPr>
-        <w:pStyle w:val="Heading2"/>
-      </w:pPr>
-      <w:r>
-        <w:t>截图说明</w:t>
-      </w:r>
-    </w:p>
-    <w:p>
-      <w:r>
-        <w:t>截图来自本机 Chrome 扩展管理页及插件实际设置界面。插件页面使用本地演示数据，未连接真实 DeepSeek 账号；演示中的任务状态和记忆条目不代表首次安装的默认数据。</w:t>
-      </w:r>
-    </w:p>
-    <w:p>
-      <w:pPr>
-        <w:pStyle w:val="Heading2"/>
-      </w:pPr>
-      <w:r>
-        <w:t>使用前了解</w:t>
-      </w:r>
-    </w:p>
-    <w:p>
-      <w:r>
-        <w:t>DeepSeek Pilot 是第三方扩展，与 DeepSeek 官方无隶属关系。记忆保存在本地，但带入、整理和压缩记忆会向 DeepSeek 发送相关内容。请先了解内容范围，再用于实际聊天。</w:t>
-      </w:r>
-    </w:p>
-    <w:p>
-      <w:r>
-        <w:br w:type="page"/>
-      </w:r>
-    </w:p>
-    <w:p>
-      <w:pPr>
-        <w:pStyle w:val="Heading1"/>
-      </w:pPr>
-      <w:r>
-        <w:t>导入和加载插件</w:t>
-      </w:r>
-    </w:p>
-    <w:p>
-      <w:pPr>
-        <w:pStyle w:val="Heading2"/>
-      </w:pPr>
-      <w:r>
-        <w:t>Chrome 安装步骤</w:t>
-      </w:r>
-    </w:p>
-    <w:p>
-      <w:r>
-        <w:t>1  在仓库主页点击 Code → Download ZIP。将 ZIP 解压到固定目录；不要直接从压缩包加载。已有源码可直接使用。</w:t>
-      </w:r>
-    </w:p>
-    <w:p>
-      <w:r>
-        <w:t>2  在地址栏输入 chrome://extensions/，开启右上角的“开发者模式”。</w:t>
-      </w:r>
-    </w:p>
-    <w:p>
+      <w:pPr>
+        <w:keepNext/>
+        <w:spacing w:after="60" w:line="240" w:lineRule="auto"/>
+        <w:jc w:val="center"/>
+        <w:snapToGrid w:val="0"/>
+      </w:pPr>
       <w:r>
         <w:drawing>
           <wp:inline xmlns:a="http://schemas.openxmlformats.org/drawingml/2006/main" xmlns:pic="http://schemas.openxmlformats.org/drawingml/2006/picture">
-            <wp:extent cx="6120000" cy="445443"/>
-            <wp:docPr id="1" name="Picture 1"/>
+            <wp:extent cx="5989320" cy="4267390"/>
+            <wp:docPr id="1" name="Picture 1" descr="图 1  根据当前代码绘制的记忆架构与数据流"/>
             <wp:cNvGraphicFramePr>
               <a:graphicFrameLocks noChangeAspect="1"/>
             </wp:cNvGraphicFramePr>
@@ -136,7 +47,158 @@
               <a:graphicData uri="http://schemas.openxmlformats.org/drawingml/2006/picture">
                 <pic:pic>
                   <pic:nvPicPr>
-                    <pic:cNvPr id="0" name="guide-install.png"/>
+                    <pic:cNvPr id="0" name="memory-architecture.png"/>
+                    <pic:cNvPicPr/>
+                  </pic:nvPicPr>
+                  <pic:blipFill>
+                    <a:blip r:embed="rId10"/>
+                    <a:stretch>
+                      <a:fillRect/>
+                    </a:stretch>
+                  </pic:blipFill>
+                  <pic:spPr>
+                    <a:xfrm>
+                      <a:off x="0" y="0"/>
+                      <a:ext cx="5989320" cy="4267390"/>
+                    </a:xfrm>
+                    <a:prstGeom prst="rect"/>
+                  </pic:spPr>
+                </pic:pic>
+              </a:graphicData>
+            </a:graphic>
+          </wp:inline>
+        </w:drawing>
+      </w:r>
+    </w:p>
+    <w:p>
+      <w:pPr>
+        <w:pStyle w:val="Caption"/>
+        <w:jc w:val="center"/>
+        <w:snapToGrid w:val="0"/>
+      </w:pPr>
+      <w:r>
+        <w:t>图 1  根据当前代码绘制的记忆架构与数据流</w:t>
+      </w:r>
+    </w:p>
+    <w:p>
+      <w:pPr>
+        <w:snapToGrid w:val="0"/>
+      </w:pPr>
+      <w:r>
+        <w:t>记忆会保存在浏览器本地；整理、压缩和带入时，相关内容会发送给 DeepSeek。插件通过网页辅助会话执行任务，无需另配模型 API key。</w:t>
+      </w:r>
+    </w:p>
+    <w:p>
+      <w:pPr>
+        <w:snapToGrid w:val="0"/>
+      </w:pPr>
+      <w:r>
+        <w:t>阅读顺序  安装 → 创建项目 → 带入项目记忆 → 验证个人记忆 → 维护与备份 → 接续与任务排查。</w:t>
+      </w:r>
+    </w:p>
+    <w:p>
+      <w:pPr>
+        <w:snapToGrid w:val="0"/>
+      </w:pPr>
+      <w:r>
+        <w:br w:type="page"/>
+      </w:r>
+    </w:p>
+    <w:p>
+      <w:pPr>
+        <w:pStyle w:val="Heading1"/>
+        <w:snapToGrid w:val="0"/>
+      </w:pPr>
+      <w:r>
+        <w:t>一 安装与加载插件</w:t>
+      </w:r>
+    </w:p>
+    <w:p>
+      <w:pPr>
+        <w:snapToGrid w:val="0"/>
+      </w:pPr>
+      <w:r>
+        <w:t>Chrome、Edge、Firefox 任选一种安装。正式使用需要可用的 DeepSeek 账号和网络；加载完成后打开或刷新 https://chat.deepseek.com/ 并自行登录。</w:t>
+      </w:r>
+    </w:p>
+    <w:p>
+      <w:pPr>
+        <w:pStyle w:val="Heading2"/>
+        <w:snapToGrid w:val="0"/>
+      </w:pPr>
+      <w:r>
+        <w:t>Chrome 和 Edge 源码加载</w:t>
+      </w:r>
+    </w:p>
+    <w:p>
+      <w:pPr>
+        <w:snapToGrid w:val="0"/>
+      </w:pPr>
+      <w:r>
+        <w:t>1. 从项目仓库下载并解压源码到固定目录。仓库地址：https://github.com/5J-5J/DeepSeek-Pilot 。</w:t>
+      </w:r>
+    </w:p>
+    <w:p>
+      <w:pPr>
+        <w:snapToGrid w:val="0"/>
+      </w:pPr>
+      <w:r>
+        <w:t>2. Chrome 打开 chrome://extensions/；Edge 打开 edge://extensions/。开启开发者模式或开发人员模式。</w:t>
+      </w:r>
+    </w:p>
+    <w:p>
+      <w:pPr>
+        <w:snapToGrid w:val="0"/>
+      </w:pPr>
+      <w:r>
+        <w:t>3. 点击“加载已解压的扩展程序”或“加载解压缩的扩展”。完整仓库选择 core 文件夹；单独扩展包选择直接包含 manifest.json 的解压文件夹。</w:t>
+      </w:r>
+    </w:p>
+    <w:p>
+      <w:pPr>
+        <w:snapToGrid w:val="0"/>
+      </w:pPr>
+      <w:r>
+        <w:t>4. 确认 DeepSeek Pilot 已启用，再刷新 DeepSeek 网页。左侧出现“项目”、加号和设置齿轮，即可继续。</w:t>
+      </w:r>
+    </w:p>
+    <w:p>
+      <w:pPr>
+        <w:pStyle w:val="Heading2"/>
+        <w:snapToGrid w:val="0"/>
+      </w:pPr>
+      <w:r>
+        <w:t>Firefox 安装</w:t>
+      </w:r>
+    </w:p>
+    <w:p>
+      <w:pPr>
+        <w:snapToGrid w:val="0"/>
+      </w:pPr>
+      <w:r>
+        <w:t>使用发行者提供的 Firefox 附加组件页面时，核对名称 DeepSeek Pilot 和作者，再点击“添加到 Firefox”，按浏览器提示确认权限和数据传输。下图展示该安装入口。</w:t>
+      </w:r>
+    </w:p>
+    <w:p>
+      <w:pPr>
+        <w:keepNext/>
+        <w:spacing w:after="60" w:line="240" w:lineRule="auto"/>
+        <w:jc w:val="center"/>
+        <w:snapToGrid w:val="0"/>
+      </w:pPr>
+      <w:r>
+        <w:drawing>
+          <wp:inline xmlns:a="http://schemas.openxmlformats.org/drawingml/2006/main" xmlns:pic="http://schemas.openxmlformats.org/drawingml/2006/picture">
+            <wp:extent cx="5760720" cy="2084874"/>
+            <wp:docPr id="2" name="Picture 2" descr="图 2  提供的 Firefox 附加组件安装页面"/>
+            <wp:cNvGraphicFramePr>
+              <a:graphicFrameLocks noChangeAspect="1"/>
+            </wp:cNvGraphicFramePr>
+            <a:graphic>
+              <a:graphicData uri="http://schemas.openxmlformats.org/drawingml/2006/picture">
+                <pic:pic>
+                  <pic:nvPicPr>
+                    <pic:cNvPr id="0" name="install.png"/>
                     <pic:cNvPicPr/>
                   </pic:nvPicPr>
                   <pic:blipFill>
@@ -148,7 +210,7 @@
                   <pic:spPr>
                     <a:xfrm>
                       <a:off x="0" y="0"/>
-                      <a:ext cx="6120000" cy="445443"/>
+                      <a:ext cx="5760720" cy="2084874"/>
                     </a:xfrm>
                     <a:prstGeom prst="rect"/>
                   </pic:spPr>
@@ -162,70 +224,33 @@
     <w:p>
       <w:pPr>
         <w:pStyle w:val="Caption"/>
+        <w:jc w:val="center"/>
+        <w:snapToGrid w:val="0"/>
       </w:pPr>
       <w:r>
-        <w:t>图 1  Chrome 扩展管理页顶部。按钮在不同版本中可能显示为“加载未打包的扩展程序”或“加载已解压的扩展程序”。</w:t>
+        <w:t>图 2  提供的 Firefox 附加组件安装页面</w:t>
       </w:r>
     </w:p>
     <w:p>
+      <w:pPr>
+        <w:snapToGrid w:val="0"/>
+      </w:pPr>
       <w:r>
-        <w:t>3  点击左上角加载按钮。在文件夹选择窗口中进入解压后的仓库，选择 core 文件夹。该文件夹内必须能看到 manifest.json。</w:t>
+        <w:t>源码临时加载：使用 Firefox 140 或更新版本，打开 about:debugging#/runtime/this-firefox，点击“临时载入附加组件”，选择 firefox/manifest.json。临时加载在浏览器重启后需重新操作；如提示站点权限，允许访问 chat.deepseek.com。</w:t>
       </w:r>
     </w:p>
     <w:p>
+      <w:pPr>
+        <w:snapToGrid w:val="0"/>
+      </w:pPr>
       <w:r>
-        <w:t>选择位置示例：</w:t>
-        <w:br/>
-        <w:t>DeepSeek-Pilot-main</w:t>
-        <w:br/>
-        <w:t xml:space="preserve">    core  ← Chrome 选择此文件夹</w:t>
-        <w:br/>
-        <w:t xml:space="preserve">        manifest.json</w:t>
-        <w:br/>
-        <w:t xml:space="preserve">    firefox</w:t>
-        <w:br/>
-        <w:t xml:space="preserve">        manifest.json</w:t>
+        <w:t>加载后保留原文件夹。找不到 manifest 时，检查是否误选 ZIP、仓库根目录，或为 Chrome／Edge 误选了 firefox 文件夹。</w:t>
       </w:r>
     </w:p>
     <w:p>
-      <w:r>
-        <w:t>4  扩展列表出现 DeepSeek Pilot，版本为 0.9.0，并处于启用状态，即表示加载完成。</w:t>
-      </w:r>
-    </w:p>
-    <w:p>
-      <w:r>
-        <w:t>5  打开 DeepSeek 网页并自行登录；已打开网页时，刷新一次。页面侧边栏出现插件项目区域后即可开始使用。</w:t>
-      </w:r>
-    </w:p>
-    <w:p>
-      <w:pPr>
-        <w:pStyle w:val="Heading2"/>
-      </w:pPr>
-      <w:r>
-        <w:t>Firefox 安装步骤</w:t>
-      </w:r>
-    </w:p>
-    <w:p>
-      <w:r>
-        <w:t>1  使用 Firefox 128 或更新版本，打开 about:debugging#/runtime/this-firefox。</w:t>
-      </w:r>
-    </w:p>
-    <w:p>
-      <w:r>
-        <w:t>2  点击“临时载入附加组件”，选择 firefox/manifest.json。不要选择 core/manifest.json。</w:t>
-      </w:r>
-    </w:p>
-    <w:p>
-      <w:r>
-        <w:t>3  打开或刷新 DeepSeek 页面；若提示站点权限，在扩展菜单允许访问 chat.deepseek.com。</w:t>
-      </w:r>
-    </w:p>
-    <w:p>
-      <w:r>
-        <w:t>Firefox 临时扩展在浏览器重启后需要重新加载。当前仓库未提供签名的长期安装包；Firefox 真实账号功能尚未验证，重要记忆请先导出备份。</w:t>
-      </w:r>
-    </w:p>
-    <w:p>
+      <w:pPr>
+        <w:snapToGrid w:val="0"/>
+      </w:pPr>
       <w:r>
         <w:br w:type="page"/>
       </w:r>
@@ -233,112 +258,32 @@
     <w:p>
       <w:pPr>
         <w:pStyle w:val="Heading1"/>
+        <w:snapToGrid w:val="0"/>
       </w:pPr>
       <w:r>
-        <w:t>创建项目和开始聊天</w:t>
+        <w:t>二 创建项目并收纳会话</w:t>
       </w:r>
     </w:p>
     <w:p>
       <w:pPr>
-        <w:pStyle w:val="Heading2"/>
+        <w:snapToGrid w:val="0"/>
       </w:pPr>
       <w:r>
-        <w:t>第一次使用按这五步操作</w:t>
+        <w:t>把持续推进的同一项工作放进一个项目。项目名称用于识别，项目目标用于说明后续会话要继续完成什么。</w:t>
       </w:r>
     </w:p>
     <w:p>
-      <w:r>
-        <w:t>1  在 DeepSeek 页面左侧找到“项目”标题，点击旁边的加号，新建项目，例如“产品策划”。</w:t>
-      </w:r>
-    </w:p>
-    <w:p>
-      <w:r>
-        <w:t>2  在项目菜单中使用“编辑项目目标”，填写希望持续完成的工作，例如“整理用户反馈并形成产品方案”。</w:t>
-      </w:r>
-    </w:p>
-    <w:p>
-      <w:r>
-        <w:t>3  打开项目菜单，点击“新建会话”。在发送首条消息前确认项目归属，并开启输入区附近的“项目记忆”。</w:t>
-      </w:r>
-    </w:p>
-    <w:p>
-      <w:r>
-        <w:t>4  输入第一条问题并发送，例如“我们先列出这次产品访谈的提纲”。个人记忆按首条规则带入；项目记忆需要选中项目且提前开启。</w:t>
-      </w:r>
-    </w:p>
-    <w:p>
-      <w:r>
-        <w:t>5  等待回答完成。插件会自动整理符合条件的新增或变化会话；点击侧边栏的设置齿轮，可查看个人和项目记忆。</w:t>
-      </w:r>
-    </w:p>
-    <w:p>
-      <w:pPr>
-        <w:pStyle w:val="Heading2"/>
-      </w:pPr>
-      <w:r>
-        <w:t>把已有会话收进项目</w:t>
-      </w:r>
-    </w:p>
-    <w:p>
-      <w:r>
-        <w:t>展开“未归类会话”，打开目标会话的菜单，在“移到项目”中选择项目。当前自动会话归类关闭，需要手动整理。</w:t>
-      </w:r>
-    </w:p>
-    <w:p>
-      <w:r>
-        <w:t>项目中的会话可从项目中移除；项目下暂不提供直接跨项目移动入口。需要换项目时，先移除，再从未归类会话移入目标项目。较早会话未出现时，点击“加载更多会话”。</w:t>
-      </w:r>
-    </w:p>
-    <w:p>
-      <w:pPr>
-        <w:pStyle w:val="Heading2"/>
-      </w:pPr>
-      <w:r>
-        <w:t>项目管理</w:t>
-      </w:r>
-    </w:p>
-    <w:p>
-      <w:r>
-        <w:t>项目菜单提供重命名、编辑项目目标、置顶和归档。归档项目可在设置页的“归档项目”中恢复。删除项目不会删除 DeepSeek 远端聊天。</w:t>
-      </w:r>
-    </w:p>
-    <w:p>
-      <w:pPr>
-        <w:pStyle w:val="Heading2"/>
-      </w:pPr>
-      <w:r>
-        <w:t>记忆什么时候生效</w:t>
-      </w:r>
-    </w:p>
-    <w:p>
-      <w:r>
-        <w:t>个人记忆和项目记忆均只在普通会话的首条消息中带入。已经聊到一半才开启项目记忆，不会补发；若想使用最新记忆，请在对应项目中新建会话。</w:t>
-      </w:r>
-    </w:p>
-    <w:p>
-      <w:r>
-        <w:t>未选项目也可以正常聊天，按个人记忆规则处理。只有附件没有文字时使用原生发送，本轮不注入记忆。上传附件并附带文字时，按文字消息规则处理。</w:t>
-      </w:r>
-    </w:p>
-    <w:p>
-      <w:r>
-        <w:br w:type="page"/>
-      </w:r>
-    </w:p>
-    <w:p>
-      <w:pPr>
-        <w:pStyle w:val="Heading1"/>
-      </w:pPr>
-      <w:r>
-        <w:t>设置和长对话接续</w:t>
-      </w:r>
-    </w:p>
-    <w:p>
+      <w:pPr>
+        <w:keepNext/>
+        <w:spacing w:after="60" w:line="240" w:lineRule="auto"/>
+        <w:jc w:val="center"/>
+        <w:snapToGrid w:val="0"/>
+      </w:pPr>
       <w:r>
         <w:drawing>
           <wp:inline xmlns:a="http://schemas.openxmlformats.org/drawingml/2006/main" xmlns:pic="http://schemas.openxmlformats.org/drawingml/2006/picture">
-            <wp:extent cx="2412000" cy="4382780"/>
-            <wp:docPr id="2" name="Picture 2"/>
+            <wp:extent cx="5760720" cy="1837030"/>
+            <wp:docPr id="3" name="Picture 3" descr="图 3  左侧项目区的加号用于新建项目，齿轮用于打开设置"/>
             <wp:cNvGraphicFramePr>
               <a:graphicFrameLocks noChangeAspect="1"/>
             </wp:cNvGraphicFramePr>
@@ -346,7 +291,7 @@
               <a:graphicData uri="http://schemas.openxmlformats.org/drawingml/2006/picture">
                 <pic:pic>
                   <pic:nvPicPr>
-                    <pic:cNvPr id="0" name="guide-settings.png"/>
+                    <pic:cNvPr id="0" name="entrance.png"/>
                     <pic:cNvPicPr/>
                   </pic:nvPicPr>
                   <pic:blipFill>
@@ -358,7 +303,7 @@
                   <pic:spPr>
                     <a:xfrm>
                       <a:off x="0" y="0"/>
-                      <a:ext cx="2412000" cy="4382780"/>
+                      <a:ext cx="5760720" cy="1837030"/>
                     </a:xfrm>
                     <a:prstGeom prst="rect"/>
                   </pic:spPr>
@@ -372,71 +317,49 @@
     <w:p>
       <w:pPr>
         <w:pStyle w:val="Caption"/>
+        <w:jc w:val="center"/>
+        <w:snapToGrid w:val="0"/>
       </w:pPr>
       <w:r>
-        <w:t>图 2  设置区域实拍裁剪。演示中的开关状态仅为示例。</w:t>
+        <w:t>图 3  左侧项目区的加号用于新建项目，齿轮用于打开设置</w:t>
       </w:r>
     </w:p>
     <w:p>
+      <w:pPr>
+        <w:snapToGrid w:val="0"/>
+      </w:pPr>
       <w:r>
-        <w:t>入口：DeepSeek 侧边栏“项目”旁的设置齿轮。设置页同时提供记忆管理。</w:t>
+        <w:t>1. 点击“项目”右侧的加号，输入项目名称，例如“产品策划”，确认创建。</w:t>
       </w:r>
     </w:p>
     <w:p>
       <w:pPr>
-        <w:pStyle w:val="Heading2"/>
+        <w:snapToGrid w:val="0"/>
       </w:pPr>
       <w:r>
-        <w:t>常用设置</w:t>
+        <w:t>2. 打开项目右侧菜单，选择“编辑项目目标”，写清工作目标，例如“整理用户反馈，形成产品方案”。</w:t>
       </w:r>
     </w:p>
     <w:p>
+      <w:pPr>
+        <w:snapToGrid w:val="0"/>
+      </w:pPr>
       <w:r>
-        <w:t>“默认带入项目记忆”控制新会话的默认行为，仍需先选项目。“起始时间”限制参与整理的会话创建时间，修改它不会删除已有记忆。</w:t>
+        <w:t>3. 在项目菜单中点击“新建会话”，再按下一页开启项目记忆并发送首条消息。</w:t>
       </w:r>
     </w:p>
     <w:p>
-      <w:r>
-        <w:t>“聊天显示”控制个人记忆、项目记忆、消息 token 与时间，以及自动化会话分组的可见性。隐藏显示不会停止记忆发送、学习或自动化任务。</w:t>
-      </w:r>
-    </w:p>
-    <w:p>
-      <w:pPr>
-        <w:pStyle w:val="Heading2"/>
-      </w:pPr>
-      <w:r>
-        <w:t>长对话与任务队列</w:t>
-      </w:r>
-    </w:p>
-    <w:p>
-      <w:r>
-        <w:t>初次使用可保留默认预算 256,000 token、接续提醒 100%、回答预留 4,000 token。开启项目记忆并达到预算后，插件会接续到同项目新会话，带入适用记忆与近期进展。</w:t>
-      </w:r>
-    </w:p>
-    <w:p>
-      <w:r>
-        <w:t>任务串行执行。设置页可暂停或继续队列；暂停不影响普通聊天。若任务结果不明，先核对目标会话与原始草稿，再重试，避免重复发送。</w:t>
-      </w:r>
-    </w:p>
-    <w:p>
-      <w:r>
-        <w:br w:type="page"/>
-      </w:r>
-    </w:p>
-    <w:p>
-      <w:pPr>
-        <w:pStyle w:val="Heading1"/>
-      </w:pPr>
-      <w:r>
-        <w:t>查看编辑及导入导出记忆</w:t>
-      </w:r>
-    </w:p>
-    <w:p>
+      <w:pPr>
+        <w:keepNext/>
+        <w:spacing w:after="60" w:line="240" w:lineRule="auto"/>
+        <w:jc w:val="center"/>
+        <w:snapToGrid w:val="0"/>
+      </w:pPr>
       <w:r>
         <w:drawing>
           <wp:inline xmlns:a="http://schemas.openxmlformats.org/drawingml/2006/main" xmlns:pic="http://schemas.openxmlformats.org/drawingml/2006/picture">
-            <wp:extent cx="4680000" cy="2907961"/>
-            <wp:docPr id="3" name="Picture 3"/>
+            <wp:extent cx="3383280" cy="1882492"/>
+            <wp:docPr id="4" name="Picture 4" descr="图 4  输入项目名称并确认；项目名可在项目菜单中修改"/>
             <wp:cNvGraphicFramePr>
               <a:graphicFrameLocks noChangeAspect="1"/>
             </wp:cNvGraphicFramePr>
@@ -444,7 +367,7 @@
               <a:graphicData uri="http://schemas.openxmlformats.org/drawingml/2006/picture">
                 <pic:pic>
                   <pic:nvPicPr>
-                    <pic:cNvPr id="0" name="guide-memory.png"/>
+                    <pic:cNvPr id="0" name="create.png"/>
                     <pic:cNvPicPr/>
                   </pic:nvPicPr>
                   <pic:blipFill>
@@ -456,7 +379,7 @@
                   <pic:spPr>
                     <a:xfrm>
                       <a:off x="0" y="0"/>
-                      <a:ext cx="4680000" cy="2907961"/>
+                      <a:ext cx="3383280" cy="1882492"/>
                     </a:xfrm>
                     <a:prstGeom prst="rect"/>
                   </pic:spPr>
@@ -470,76 +393,42 @@
     <w:p>
       <w:pPr>
         <w:pStyle w:val="Caption"/>
+        <w:jc w:val="center"/>
+        <w:snapToGrid w:val="0"/>
       </w:pPr>
       <w:r>
-        <w:t>图 3  左侧选择个人或项目范围，右上角“更多”菜单提供导入和导出。此图为本地演示数据。</w:t>
+        <w:t>图 4  输入项目名称并确认；项目名可在项目菜单中修改</w:t>
       </w:r>
     </w:p>
     <w:p>
       <w:pPr>
         <w:pStyle w:val="Heading2"/>
+        <w:snapToGrid w:val="0"/>
       </w:pPr>
       <w:r>
-        <w:t>查看和编辑</w:t>
+        <w:t>把已有会话移入项目</w:t>
       </w:r>
     </w:p>
     <w:p>
+      <w:pPr>
+        <w:snapToGrid w:val="0"/>
+      </w:pPr>
       <w:r>
-        <w:t>1  在记忆区域左侧选择“个人记忆”或具体项目。右侧按类别展示条目。</w:t>
+        <w:t>在“未归类会话”中打开目标会话菜单，选择“移到项目”，再选择项目。当前自动归类关闭。项目中的会话要换项目时，先“从项目中移除”，再从未归类会话移入目标项目。</w:t>
       </w:r>
     </w:p>
     <w:p>
+      <w:pPr>
+        <w:snapToGrid w:val="0"/>
+      </w:pPr>
       <w:r>
-        <w:t>2  将鼠标移到类别卡片，点击“编辑”。每个输入框对应一条记忆；修改后点击“保存类别”。清空条目会在保存时删除该条。</w:t>
+        <w:t>项目菜单还可重命名、置顶和归档。已归档项目可在设置页“归档项目”中恢复。较早会话未出现时，点击“加载更多会话”；未加载不表示原项目归属丢失。</w:t>
       </w:r>
     </w:p>
     <w:p>
-      <w:r>
-        <w:t>3  人工维护的重要内容会作为固定记忆受到自动整理保护；使用批量删除时仍需核对删除范围。</w:t>
-      </w:r>
-    </w:p>
-    <w:p>
-      <w:pPr>
-        <w:pStyle w:val="Heading2"/>
-      </w:pPr>
-      <w:r>
-        <w:t>导出备份</w:t>
-      </w:r>
-    </w:p>
-    <w:p>
-      <w:r>
-        <w:t>选择需要备份的范围 → 更多 → 导出记忆。个人范围下载 deepseek-personal-memories.json；项目范围下载 deepseek-project-memories.json。每次导出当前范围，不是完整浏览器或完整聊天备份。多个项目请分别导出。</w:t>
-      </w:r>
-    </w:p>
-    <w:p>
-      <w:pPr>
-        <w:pStyle w:val="Heading2"/>
-      </w:pPr>
-      <w:r>
-        <w:t>导入或跨浏览器迁移</w:t>
-      </w:r>
-    </w:p>
-    <w:p>
-      <w:r>
-        <w:t>1  在目标浏览器加载插件并打开设置页。迁移项目记忆时，先建立与备份中同名的项目；匹配优先使用项目 ID，其次使用项目名称。</w:t>
-      </w:r>
-    </w:p>
-    <w:p>
-      <w:r>
-        <w:t>2  点击 更多 → 导入记忆，选择插件先前导出的 JSON 文件。不要选择 Word、ZIP 或插件源码。</w:t>
-      </w:r>
-    </w:p>
-    <w:p>
-      <w:r>
-        <w:t>3  阅读预览中的导入数量、重复 ID 和未映射项目数量。未映射项目不会导入；需要时取消导入，先建立同名项目后重试。</w:t>
-      </w:r>
-    </w:p>
-    <w:p>
-      <w:r>
-        <w:t>4  确认导入后，查看“已导入”和“跳过”数量，再切换到对应范围核对内容。Chrome 与 Firefox 的本地数据分别保存，需要这样手动迁移。</w:t>
-      </w:r>
-    </w:p>
-    <w:p>
+      <w:pPr>
+        <w:snapToGrid w:val="0"/>
+      </w:pPr>
       <w:r>
         <w:br w:type="page"/>
       </w:r>
@@ -547,138 +436,3581 @@
     <w:p>
       <w:pPr>
         <w:pStyle w:val="Heading1"/>
+        <w:snapToGrid w:val="0"/>
       </w:pPr>
       <w:r>
-        <w:t>更新插件和排查问题</w:t>
+        <w:t>三 在新会话中带入项目记忆</w:t>
       </w:r>
     </w:p>
     <w:p>
       <w:pPr>
-        <w:pStyle w:val="Heading2"/>
+        <w:snapToGrid w:val="0"/>
       </w:pPr>
       <w:r>
-        <w:t>更新已加载的插件</w:t>
+        <w:t>项目记忆保存目标、约束、决定、进展、阻塞和下一步。使用前必须确定项目，并在首条消息发送前开启项目记忆。</w:t>
       </w:r>
     </w:p>
     <w:p>
+      <w:pPr>
+        <w:keepNext/>
+        <w:spacing w:after="60" w:line="240" w:lineRule="auto"/>
+        <w:jc w:val="center"/>
+        <w:snapToGrid w:val="0"/>
+      </w:pPr>
       <w:r>
-        <w:t>先导出重要记忆。ZIP 安装将新源码解压到原安装位置；Git 安装在仓库目录运行 git pull --ff-only。Chrome 在扩展管理页重新加载 DeepSeek Pilot，再刷新 DeepSeek 页面；Firefox 在调试页重新载入，再刷新页面。</w:t>
+        <w:drawing>
+          <wp:inline xmlns:a="http://schemas.openxmlformats.org/drawingml/2006/main" xmlns:pic="http://schemas.openxmlformats.org/drawingml/2006/picture">
+            <wp:extent cx="5760720" cy="2228850"/>
+            <wp:docPr id="5" name="Picture 5" descr="图 5  首次发送前，使用输入区附近的“项目记忆”入口选择项目"/>
+            <wp:cNvGraphicFramePr>
+              <a:graphicFrameLocks noChangeAspect="1"/>
+            </wp:cNvGraphicFramePr>
+            <a:graphic>
+              <a:graphicData uri="http://schemas.openxmlformats.org/drawingml/2006/picture">
+                <pic:pic>
+                  <pic:nvPicPr>
+                    <pic:cNvPr id="0" name="toggle.png"/>
+                    <pic:cNvPicPr/>
+                  </pic:nvPicPr>
+                  <pic:blipFill>
+                    <a:blip r:embed="rId14"/>
+                    <a:stretch>
+                      <a:fillRect/>
+                    </a:stretch>
+                  </pic:blipFill>
+                  <pic:spPr>
+                    <a:xfrm>
+                      <a:off x="0" y="0"/>
+                      <a:ext cx="5760720" cy="2228850"/>
+                    </a:xfrm>
+                    <a:prstGeom prst="rect"/>
+                  </pic:spPr>
+                </pic:pic>
+              </a:graphicData>
+            </a:graphic>
+          </wp:inline>
+        </w:drawing>
       </w:r>
     </w:p>
     <w:p>
+      <w:pPr>
+        <w:pStyle w:val="Caption"/>
+        <w:jc w:val="center"/>
+        <w:snapToGrid w:val="0"/>
+      </w:pPr>
       <w:r>
-        <w:t>保留加载时使用的文件夹，不要随意移动或删除。不必为正常更新卸载扩展。清除扩展数据会清除本地记忆及快照。</w:t>
+        <w:t>图 5  首次发送前，使用输入区附近的“项目记忆”入口选择项目</w:t>
       </w:r>
     </w:p>
     <w:p>
       <w:pPr>
-        <w:pStyle w:val="Heading2"/>
+        <w:snapToGrid w:val="0"/>
       </w:pPr>
       <w:r>
-        <w:t>常见问题</w:t>
+        <w:t>1. 开启新对话，点击输入区附近的“项目记忆”，选择要继续工作的项目；也可从项目菜单直接新建会话。</w:t>
       </w:r>
     </w:p>
     <w:p>
       <w:pPr>
-        <w:pStyle w:val="Heading2"/>
+        <w:snapToGrid w:val="0"/>
       </w:pPr>
       <w:r>
-        <w:t>提示找不到 manifest</w:t>
+        <w:t>2. 确认项目记忆已开启，再输入本轮问题，例如“根据已有决定，列出产品方案下一步要完成的事项”。</w:t>
       </w:r>
     </w:p>
     <w:p>
+      <w:pPr>
+        <w:snapToGrid w:val="0"/>
+      </w:pPr>
       <w:r>
-        <w:t>Chrome 应选包含 manifest.json 的 core 文件夹，而不是仓库根目录、ZIP 文件或 firefox 文件夹。Firefox 应选择 firefox/manifest.json。</w:t>
+        <w:t>3. 发送后，会话按所选项目归属保存。插件会把适用的个人记忆、本项目目标和选中的生效项目记忆一起作为背景发送。</w:t>
       </w:r>
     </w:p>
     <w:p>
       <w:pPr>
-        <w:pStyle w:val="Heading2"/>
+        <w:snapToGrid w:val="0"/>
       </w:pPr>
       <w:r>
-        <w:t>网页没有项目区域</w:t>
+        <w:t>4. 等待回答完成，后续符合条件的内容会进入记忆整理队列。查看整理结果时打开设置页，选择对应项目。</w:t>
       </w:r>
     </w:p>
     <w:p>
+      <w:pPr>
+        <w:pStyle w:val="Heading2"/>
+        <w:snapToGrid w:val="0"/>
+      </w:pPr>
       <w:r>
-        <w:t>确认扩展已启用、访问的是 chat.deepseek.com，并刷新网页。Firefox 还需核对站点访问权限。</w:t>
+        <w:t>不同情况的带入规则</w:t>
+      </w:r>
+    </w:p>
+    <w:tbl>
+      <w:tblPr>
+        <w:tblW w:type="auto" w:w="0"/>
+        <w:jc w:val="center"/>
+        <w:tblLayout w:type="fixed"/>
+        <w:tblLook w:firstColumn="1" w:firstRow="1" w:lastColumn="0" w:lastRow="0" w:noHBand="0" w:noVBand="1" w:val="04A0"/>
+      </w:tblPr>
+      <w:tblGrid>
+        <w:gridCol w:w="2835"/>
+        <w:gridCol w:w="6803"/>
+      </w:tblGrid>
+      <w:tr>
+        <w:trPr>
+          <w:cantSplit/>
+          <w:tblHeader/>
+        </w:trPr>
+        <w:tc>
+          <w:tcPr>
+            <w:tcW w:type="dxa" w:w="2835"/>
+            <w:vAlign w:val="center"/>
+            <w:tcBorders>
+              <w:top w:val="single" w:sz="4" w:color="D9D9D9"/>
+              <w:left w:val="single" w:sz="4" w:color="D9D9D9"/>
+              <w:bottom w:val="single" w:sz="4" w:color="D9D9D9"/>
+              <w:right w:val="single" w:sz="4" w:color="D9D9D9"/>
+            </w:tcBorders>
+            <w:tcMar>
+              <w:top w:w="95" w:type="dxa"/>
+              <w:left w:w="95" w:type="dxa"/>
+              <w:bottom w:w="95" w:type="dxa"/>
+              <w:right w:w="95" w:type="dxa"/>
+            </w:tcMar>
+            <w:shd w:fill="DCE8F3"/>
+          </w:tcPr>
+          <w:p>
+            <w:pPr>
+              <w:spacing w:after="40" w:line="260" w:lineRule="exact"/>
+              <w:snapToGrid w:val="0"/>
+            </w:pPr>
+            <w:r>
+              <w:rPr>
+                <w:b/>
+                <w:sz w:val="19"/>
+              </w:rPr>
+              <w:t>情况</w:t>
+            </w:r>
+          </w:p>
+        </w:tc>
+        <w:tc>
+          <w:tcPr>
+            <w:tcW w:type="dxa" w:w="6803"/>
+            <w:vAlign w:val="center"/>
+            <w:tcBorders>
+              <w:top w:val="single" w:sz="4" w:color="D9D9D9"/>
+              <w:left w:val="single" w:sz="4" w:color="D9D9D9"/>
+              <w:bottom w:val="single" w:sz="4" w:color="D9D9D9"/>
+              <w:right w:val="single" w:sz="4" w:color="D9D9D9"/>
+            </w:tcBorders>
+            <w:tcMar>
+              <w:top w:w="95" w:type="dxa"/>
+              <w:left w:w="95" w:type="dxa"/>
+              <w:bottom w:w="95" w:type="dxa"/>
+              <w:right w:w="95" w:type="dxa"/>
+            </w:tcMar>
+            <w:shd w:fill="DCE8F3"/>
+          </w:tcPr>
+          <w:p>
+            <w:pPr>
+              <w:spacing w:after="40" w:line="260" w:lineRule="exact"/>
+              <w:snapToGrid w:val="0"/>
+            </w:pPr>
+            <w:r>
+              <w:rPr>
+                <w:b/>
+                <w:sz w:val="19"/>
+              </w:rPr>
+              <w:t>实际行为</w:t>
+            </w:r>
+          </w:p>
+        </w:tc>
+      </w:tr>
+      <w:tr>
+        <w:trPr>
+          <w:cantSplit/>
+        </w:trPr>
+        <w:tc>
+          <w:tcPr>
+            <w:tcW w:type="dxa" w:w="2835"/>
+            <w:vAlign w:val="center"/>
+            <w:tcBorders>
+              <w:top w:val="single" w:sz="4" w:color="D9D9D9"/>
+              <w:left w:val="single" w:sz="4" w:color="D9D9D9"/>
+              <w:bottom w:val="single" w:sz="4" w:color="D9D9D9"/>
+              <w:right w:val="single" w:sz="4" w:color="D9D9D9"/>
+            </w:tcBorders>
+            <w:tcMar>
+              <w:top w:w="95" w:type="dxa"/>
+              <w:left w:w="95" w:type="dxa"/>
+              <w:bottom w:w="95" w:type="dxa"/>
+              <w:right w:w="95" w:type="dxa"/>
+            </w:tcMar>
+            <w:shd w:fill="FFFFFF"/>
+          </w:tcPr>
+          <w:p>
+            <w:pPr>
+              <w:spacing w:after="40" w:line="260" w:lineRule="exact"/>
+              <w:snapToGrid w:val="0"/>
+            </w:pPr>
+            <w:r>
+              <w:rPr>
+                <w:b w:val="0"/>
+                <w:sz w:val="19"/>
+              </w:rPr>
+              <w:t>普通新会话 首条有文字</w:t>
+            </w:r>
+          </w:p>
+        </w:tc>
+        <w:tc>
+          <w:tcPr>
+            <w:tcW w:type="dxa" w:w="6803"/>
+            <w:vAlign w:val="center"/>
+            <w:tcBorders>
+              <w:top w:val="single" w:sz="4" w:color="D9D9D9"/>
+              <w:left w:val="single" w:sz="4" w:color="D9D9D9"/>
+              <w:bottom w:val="single" w:sz="4" w:color="D9D9D9"/>
+              <w:right w:val="single" w:sz="4" w:color="D9D9D9"/>
+            </w:tcBorders>
+            <w:tcMar>
+              <w:top w:w="95" w:type="dxa"/>
+              <w:left w:w="95" w:type="dxa"/>
+              <w:bottom w:w="95" w:type="dxa"/>
+              <w:right w:w="95" w:type="dxa"/>
+            </w:tcMar>
+            <w:shd w:fill="FFFFFF"/>
+          </w:tcPr>
+          <w:p>
+            <w:pPr>
+              <w:spacing w:after="40" w:line="260" w:lineRule="exact"/>
+              <w:snapToGrid w:val="0"/>
+            </w:pPr>
+            <w:r>
+              <w:rPr>
+                <w:b w:val="0"/>
+                <w:sz w:val="19"/>
+              </w:rPr>
+              <w:t>按规则带入已生效的个人记忆；未选项目也能正常聊天。</w:t>
+            </w:r>
+          </w:p>
+        </w:tc>
+      </w:tr>
+      <w:tr>
+        <w:trPr>
+          <w:cantSplit/>
+        </w:trPr>
+        <w:tc>
+          <w:tcPr>
+            <w:tcW w:type="dxa" w:w="2835"/>
+            <w:vAlign w:val="center"/>
+            <w:tcBorders>
+              <w:top w:val="single" w:sz="4" w:color="D9D9D9"/>
+              <w:left w:val="single" w:sz="4" w:color="D9D9D9"/>
+              <w:bottom w:val="single" w:sz="4" w:color="D9D9D9"/>
+              <w:right w:val="single" w:sz="4" w:color="D9D9D9"/>
+            </w:tcBorders>
+            <w:tcMar>
+              <w:top w:w="95" w:type="dxa"/>
+              <w:left w:w="95" w:type="dxa"/>
+              <w:bottom w:w="95" w:type="dxa"/>
+              <w:right w:w="95" w:type="dxa"/>
+            </w:tcMar>
+            <w:shd w:fill="F5F8FB"/>
+          </w:tcPr>
+          <w:p>
+            <w:pPr>
+              <w:spacing w:after="40" w:line="260" w:lineRule="exact"/>
+              <w:snapToGrid w:val="0"/>
+            </w:pPr>
+            <w:r>
+              <w:rPr>
+                <w:b w:val="0"/>
+                <w:sz w:val="19"/>
+              </w:rPr>
+              <w:t>已选项目 且开启项目记忆</w:t>
+            </w:r>
+          </w:p>
+        </w:tc>
+        <w:tc>
+          <w:tcPr>
+            <w:tcW w:type="dxa" w:w="6803"/>
+            <w:vAlign w:val="center"/>
+            <w:tcBorders>
+              <w:top w:val="single" w:sz="4" w:color="D9D9D9"/>
+              <w:left w:val="single" w:sz="4" w:color="D9D9D9"/>
+              <w:bottom w:val="single" w:sz="4" w:color="D9D9D9"/>
+              <w:right w:val="single" w:sz="4" w:color="D9D9D9"/>
+            </w:tcBorders>
+            <w:tcMar>
+              <w:top w:w="95" w:type="dxa"/>
+              <w:left w:w="95" w:type="dxa"/>
+              <w:bottom w:w="95" w:type="dxa"/>
+              <w:right w:w="95" w:type="dxa"/>
+            </w:tcMar>
+            <w:shd w:fill="F5F8FB"/>
+          </w:tcPr>
+          <w:p>
+            <w:pPr>
+              <w:spacing w:after="40" w:line="260" w:lineRule="exact"/>
+              <w:snapToGrid w:val="0"/>
+            </w:pPr>
+            <w:r>
+              <w:rPr>
+                <w:b w:val="0"/>
+                <w:sz w:val="19"/>
+              </w:rPr>
+              <w:t>首条文字消息可带入本项目目标及记忆。</w:t>
+            </w:r>
+          </w:p>
+        </w:tc>
+      </w:tr>
+      <w:tr>
+        <w:trPr>
+          <w:cantSplit/>
+        </w:trPr>
+        <w:tc>
+          <w:tcPr>
+            <w:tcW w:type="dxa" w:w="2835"/>
+            <w:vAlign w:val="center"/>
+            <w:tcBorders>
+              <w:top w:val="single" w:sz="4" w:color="D9D9D9"/>
+              <w:left w:val="single" w:sz="4" w:color="D9D9D9"/>
+              <w:bottom w:val="single" w:sz="4" w:color="D9D9D9"/>
+              <w:right w:val="single" w:sz="4" w:color="D9D9D9"/>
+            </w:tcBorders>
+            <w:tcMar>
+              <w:top w:w="95" w:type="dxa"/>
+              <w:left w:w="95" w:type="dxa"/>
+              <w:bottom w:w="95" w:type="dxa"/>
+              <w:right w:w="95" w:type="dxa"/>
+            </w:tcMar>
+            <w:shd w:fill="FFFFFF"/>
+          </w:tcPr>
+          <w:p>
+            <w:pPr>
+              <w:spacing w:after="40" w:line="260" w:lineRule="exact"/>
+              <w:snapToGrid w:val="0"/>
+            </w:pPr>
+            <w:r>
+              <w:rPr>
+                <w:b w:val="0"/>
+                <w:sz w:val="19"/>
+              </w:rPr>
+              <w:t>会话中途才开启项目记忆</w:t>
+            </w:r>
+          </w:p>
+        </w:tc>
+        <w:tc>
+          <w:tcPr>
+            <w:tcW w:type="dxa" w:w="6803"/>
+            <w:vAlign w:val="center"/>
+            <w:tcBorders>
+              <w:top w:val="single" w:sz="4" w:color="D9D9D9"/>
+              <w:left w:val="single" w:sz="4" w:color="D9D9D9"/>
+              <w:bottom w:val="single" w:sz="4" w:color="D9D9D9"/>
+              <w:right w:val="single" w:sz="4" w:color="D9D9D9"/>
+            </w:tcBorders>
+            <w:tcMar>
+              <w:top w:w="95" w:type="dxa"/>
+              <w:left w:w="95" w:type="dxa"/>
+              <w:bottom w:w="95" w:type="dxa"/>
+              <w:right w:w="95" w:type="dxa"/>
+            </w:tcMar>
+            <w:shd w:fill="FFFFFF"/>
+          </w:tcPr>
+          <w:p>
+            <w:pPr>
+              <w:spacing w:after="40" w:line="260" w:lineRule="exact"/>
+              <w:snapToGrid w:val="0"/>
+            </w:pPr>
+            <w:r>
+              <w:rPr>
+                <w:b w:val="0"/>
+                <w:sz w:val="19"/>
+              </w:rPr>
+              <w:t>不补发已有记忆；需要最新背景时，在该项目中新建会话。</w:t>
+            </w:r>
+          </w:p>
+        </w:tc>
+      </w:tr>
+      <w:tr>
+        <w:trPr>
+          <w:cantSplit/>
+        </w:trPr>
+        <w:tc>
+          <w:tcPr>
+            <w:tcW w:type="dxa" w:w="2835"/>
+            <w:vAlign w:val="center"/>
+            <w:tcBorders>
+              <w:top w:val="single" w:sz="4" w:color="D9D9D9"/>
+              <w:left w:val="single" w:sz="4" w:color="D9D9D9"/>
+              <w:bottom w:val="single" w:sz="4" w:color="D9D9D9"/>
+              <w:right w:val="single" w:sz="4" w:color="D9D9D9"/>
+            </w:tcBorders>
+            <w:tcMar>
+              <w:top w:w="95" w:type="dxa"/>
+              <w:left w:w="95" w:type="dxa"/>
+              <w:bottom w:w="95" w:type="dxa"/>
+              <w:right w:w="95" w:type="dxa"/>
+            </w:tcMar>
+            <w:shd w:fill="F5F8FB"/>
+          </w:tcPr>
+          <w:p>
+            <w:pPr>
+              <w:spacing w:after="40" w:line="260" w:lineRule="exact"/>
+              <w:snapToGrid w:val="0"/>
+            </w:pPr>
+            <w:r>
+              <w:rPr>
+                <w:b w:val="0"/>
+                <w:sz w:val="19"/>
+              </w:rPr>
+              <w:t>只有附件 没有文字</w:t>
+            </w:r>
+          </w:p>
+        </w:tc>
+        <w:tc>
+          <w:tcPr>
+            <w:tcW w:type="dxa" w:w="6803"/>
+            <w:vAlign w:val="center"/>
+            <w:tcBorders>
+              <w:top w:val="single" w:sz="4" w:color="D9D9D9"/>
+              <w:left w:val="single" w:sz="4" w:color="D9D9D9"/>
+              <w:bottom w:val="single" w:sz="4" w:color="D9D9D9"/>
+              <w:right w:val="single" w:sz="4" w:color="D9D9D9"/>
+            </w:tcBorders>
+            <w:tcMar>
+              <w:top w:w="95" w:type="dxa"/>
+              <w:left w:w="95" w:type="dxa"/>
+              <w:bottom w:w="95" w:type="dxa"/>
+              <w:right w:w="95" w:type="dxa"/>
+            </w:tcMar>
+            <w:shd w:fill="F5F8FB"/>
+          </w:tcPr>
+          <w:p>
+            <w:pPr>
+              <w:spacing w:after="40" w:line="260" w:lineRule="exact"/>
+              <w:snapToGrid w:val="0"/>
+            </w:pPr>
+            <w:r>
+              <w:rPr>
+                <w:b w:val="0"/>
+                <w:sz w:val="19"/>
+              </w:rPr>
+              <w:t>本轮按原生方式发送，不注入记忆；后续不因此补发首条记忆。</w:t>
+            </w:r>
+          </w:p>
+        </w:tc>
+      </w:tr>
+      <w:tr>
+        <w:trPr>
+          <w:cantSplit/>
+        </w:trPr>
+        <w:tc>
+          <w:tcPr>
+            <w:tcW w:type="dxa" w:w="2835"/>
+            <w:vAlign w:val="center"/>
+            <w:tcBorders>
+              <w:top w:val="single" w:sz="4" w:color="D9D9D9"/>
+              <w:left w:val="single" w:sz="4" w:color="D9D9D9"/>
+              <w:bottom w:val="single" w:sz="4" w:color="D9D9D9"/>
+              <w:right w:val="single" w:sz="4" w:color="D9D9D9"/>
+            </w:tcBorders>
+            <w:tcMar>
+              <w:top w:w="95" w:type="dxa"/>
+              <w:left w:w="95" w:type="dxa"/>
+              <w:bottom w:w="95" w:type="dxa"/>
+              <w:right w:w="95" w:type="dxa"/>
+            </w:tcMar>
+            <w:shd w:fill="FFFFFF"/>
+          </w:tcPr>
+          <w:p>
+            <w:pPr>
+              <w:spacing w:after="40" w:line="260" w:lineRule="exact"/>
+              <w:snapToGrid w:val="0"/>
+            </w:pPr>
+            <w:r>
+              <w:rPr>
+                <w:b w:val="0"/>
+                <w:sz w:val="19"/>
+              </w:rPr>
+              <w:t>附件并附带文字</w:t>
+            </w:r>
+          </w:p>
+        </w:tc>
+        <w:tc>
+          <w:tcPr>
+            <w:tcW w:type="dxa" w:w="6803"/>
+            <w:vAlign w:val="center"/>
+            <w:tcBorders>
+              <w:top w:val="single" w:sz="4" w:color="D9D9D9"/>
+              <w:left w:val="single" w:sz="4" w:color="D9D9D9"/>
+              <w:bottom w:val="single" w:sz="4" w:color="D9D9D9"/>
+              <w:right w:val="single" w:sz="4" w:color="D9D9D9"/>
+            </w:tcBorders>
+            <w:tcMar>
+              <w:top w:w="95" w:type="dxa"/>
+              <w:left w:w="95" w:type="dxa"/>
+              <w:bottom w:w="95" w:type="dxa"/>
+              <w:right w:w="95" w:type="dxa"/>
+            </w:tcMar>
+            <w:shd w:fill="FFFFFF"/>
+          </w:tcPr>
+          <w:p>
+            <w:pPr>
+              <w:spacing w:after="40" w:line="260" w:lineRule="exact"/>
+              <w:snapToGrid w:val="0"/>
+            </w:pPr>
+            <w:r>
+              <w:rPr>
+                <w:b w:val="0"/>
+                <w:sz w:val="19"/>
+              </w:rPr>
+              <w:t>按文字消息规则处理，是否带入仍取决于首条和项目开关。</w:t>
+            </w:r>
+          </w:p>
+        </w:tc>
+      </w:tr>
+    </w:tbl>
+    <w:p>
+      <w:pPr>
+        <w:snapToGrid w:val="0"/>
+      </w:pPr>
+    </w:p>
+    <w:p>
+      <w:pPr>
+        <w:snapToGrid w:val="0"/>
+      </w:pPr>
+      <w:r>
+        <w:t>带入的是经过筛选的记忆背景，不是把所有历史聊天完整重发。记忆条目存在，不代表每一条都会在本次请求中被选中。</w:t>
       </w:r>
     </w:p>
     <w:p>
       <w:pPr>
-        <w:pStyle w:val="Heading2"/>
+        <w:snapToGrid w:val="0"/>
       </w:pPr>
       <w:r>
-        <w:t>看不到更早的会话</w:t>
+        <w:br w:type="page"/>
       </w:r>
     </w:p>
     <w:p>
+      <w:pPr>
+        <w:pStyle w:val="Heading1"/>
+        <w:snapToGrid w:val="0"/>
+      </w:pPr>
       <w:r>
-        <w:t>点击“加载更多会话”。列表以 DeepSeek 当前返回的会话为准，未加载不等于会话归属丢失。</w:t>
+        <w:t>四 认识并验证个人记忆</w:t>
       </w:r>
     </w:p>
     <w:p>
       <w:pPr>
-        <w:pStyle w:val="Heading2"/>
+        <w:snapToGrid w:val="0"/>
       </w:pPr>
       <w:r>
-        <w:t>开启记忆后没有补充背景</w:t>
+        <w:t>个人记忆保存跨项目适用的个人资料、偏好、工作方式、术语和其他长期背景。项目会话也能贡献个人偏好；项目专属的目标与进展则分开保存。</w:t>
       </w:r>
     </w:p>
     <w:p>
+      <w:pPr>
+        <w:keepNext/>
+        <w:spacing w:after="60" w:line="240" w:lineRule="auto"/>
+        <w:jc w:val="center"/>
+        <w:snapToGrid w:val="0"/>
+      </w:pPr>
       <w:r>
-        <w:t>记忆仅在首条消息带入。确认已选项目并开启项目记忆，再在项目中新建会话发送首条消息。</w:t>
+        <w:drawing>
+          <wp:inline xmlns:a="http://schemas.openxmlformats.org/drawingml/2006/main" xmlns:pic="http://schemas.openxmlformats.org/drawingml/2006/picture">
+            <wp:extent cx="5760720" cy="1638119"/>
+            <wp:docPr id="6" name="Picture 6" descr="图 6  个人记忆按类别展示；原截图中的个人资料正文已遮盖"/>
+            <wp:cNvGraphicFramePr>
+              <a:graphicFrameLocks noChangeAspect="1"/>
+            </wp:cNvGraphicFramePr>
+            <a:graphic>
+              <a:graphicData uri="http://schemas.openxmlformats.org/drawingml/2006/picture">
+                <pic:pic>
+                  <pic:nvPicPr>
+                    <pic:cNvPr id="0" name="personal.png"/>
+                    <pic:cNvPicPr/>
+                  </pic:nvPicPr>
+                  <pic:blipFill>
+                    <a:blip r:embed="rId15"/>
+                    <a:stretch>
+                      <a:fillRect/>
+                    </a:stretch>
+                  </pic:blipFill>
+                  <pic:spPr>
+                    <a:xfrm>
+                      <a:off x="0" y="0"/>
+                      <a:ext cx="5760720" cy="1638119"/>
+                    </a:xfrm>
+                    <a:prstGeom prst="rect"/>
+                  </pic:spPr>
+                </pic:pic>
+              </a:graphicData>
+            </a:graphic>
+          </wp:inline>
+        </w:drawing>
       </w:r>
     </w:p>
     <w:p>
       <w:pPr>
-        <w:pStyle w:val="Heading2"/>
+        <w:pStyle w:val="Caption"/>
+        <w:jc w:val="center"/>
+        <w:snapToGrid w:val="0"/>
       </w:pPr>
       <w:r>
-        <w:t>记忆没有马上更新</w:t>
+        <w:t>图 6  个人记忆按类别展示；原截图中的个人资料正文已遮盖</w:t>
       </w:r>
     </w:p>
     <w:p>
+      <w:pPr>
+        <w:pStyle w:val="Heading2"/>
+        <w:snapToGrid w:val="0"/>
+      </w:pPr>
       <w:r>
-        <w:t>先等待原回答完成，再查看自动化队列。“更新记忆”可主动整理所选范围；“起始时间”之前的会话不会参与自动整理。</w:t>
+        <w:t>完成一次可核对的体验</w:t>
       </w:r>
     </w:p>
     <w:p>
       <w:pPr>
-        <w:pStyle w:val="Heading2"/>
+        <w:snapToGrid w:val="0"/>
       </w:pPr>
       <w:r>
-        <w:t>任务失败或要求核对</w:t>
+        <w:t>1. 在设置页的记忆区域选择“个人记忆”。打开“偏好”的“编辑”，填入“以后用中文回答，先给结论”，点击“保存类别”。</w:t>
       </w:r>
     </w:p>
     <w:p>
+      <w:pPr>
+        <w:snapToGrid w:val="0"/>
+      </w:pPr>
       <w:r>
-        <w:t>在设置页查看“需要核对的任务”，检查目标会话、错误信息与保留草稿。先确认 DeepSeek 普通聊天恢复，再重试或继续队列。</w:t>
+        <w:t>2. 开启一个普通新会话，可以不选项目，首条发送“介绍一下你对我的回答偏好的理解”。</w:t>
       </w:r>
     </w:p>
     <w:p>
       <w:pPr>
-        <w:pStyle w:val="Heading2"/>
+        <w:snapToGrid w:val="0"/>
       </w:pPr>
       <w:r>
-        <w:t>数据保留与清理</w:t>
+        <w:t>3. 核对回答是否体现刚才保存的偏好。回答可用于体验效果，实际保存内容仍以记忆管理页为准。</w:t>
       </w:r>
     </w:p>
     <w:p>
+      <w:pPr>
+        <w:keepNext/>
+        <w:spacing w:after="60" w:line="240" w:lineRule="auto"/>
+        <w:jc w:val="center"/>
+        <w:snapToGrid w:val="0"/>
+      </w:pPr>
       <w:r>
-        <w:t>插件生成的辅助会话保留最近 10 条，符合清理条件的更早记录会从 DeepSeek 删除；手动收纳记录受保护。自动化分组默认收起，展开显示最近 5 条，显示数量不等于保留数量。</w:t>
+        <w:drawing>
+          <wp:inline xmlns:a="http://schemas.openxmlformats.org/drawingml/2006/main" xmlns:pic="http://schemas.openxmlformats.org/drawingml/2006/picture">
+            <wp:extent cx="5212080" cy="2280285"/>
+            <wp:docPr id="7" name="Picture 7" descr="图 7  在新会话首条消息中验证个人记忆；截图注释中的“任何会话”需按首条规则理解"/>
+            <wp:cNvGraphicFramePr>
+              <a:graphicFrameLocks noChangeAspect="1"/>
+            </wp:cNvGraphicFramePr>
+            <a:graphic>
+              <a:graphicData uri="http://schemas.openxmlformats.org/drawingml/2006/picture">
+                <pic:pic>
+                  <pic:nvPicPr>
+                    <pic:cNvPr id="0" name="verify.png"/>
+                    <pic:cNvPicPr/>
+                  </pic:nvPicPr>
+                  <pic:blipFill>
+                    <a:blip r:embed="rId16"/>
+                    <a:stretch>
+                      <a:fillRect/>
+                    </a:stretch>
+                  </pic:blipFill>
+                  <pic:spPr>
+                    <a:xfrm>
+                      <a:off x="0" y="0"/>
+                      <a:ext cx="5212080" cy="2280285"/>
+                    </a:xfrm>
+                    <a:prstGeom prst="rect"/>
+                  </pic:spPr>
+                </pic:pic>
+              </a:graphicData>
+            </a:graphic>
+          </wp:inline>
+        </w:drawing>
       </w:r>
     </w:p>
     <w:p>
+      <w:pPr>
+        <w:pStyle w:val="Caption"/>
+        <w:jc w:val="center"/>
+        <w:snapToGrid w:val="0"/>
+      </w:pPr>
       <w:r>
-        <w:t>本教程依据仓库 README、插件清单与界面实现编写。截图为离线演示，未执行真实账号登录、消息发送或记忆迁移。</w:t>
+        <w:t>图 7  在新会话首条消息中验证个人记忆；截图注释中的“任何会话”需按首条规则理解</w:t>
+      </w:r>
+    </w:p>
+    <w:p>
+      <w:pPr>
+        <w:snapToGrid w:val="0"/>
+      </w:pPr>
+      <w:r>
+        <w:t>自动整理优先保留反复适用的偏好与协作习惯。事件只保存对长期生活、职业或后续协作有影响的关键结果，不保存日常琐事和详细经过。请把需要记住的事实说清楚，不要依赖模型猜测身份或偏好。</w:t>
+      </w:r>
+    </w:p>
+    <w:p>
+      <w:pPr>
+        <w:snapToGrid w:val="0"/>
+      </w:pPr>
+      <w:r>
+        <w:br w:type="page"/>
+      </w:r>
+    </w:p>
+    <w:p>
+      <w:pPr>
+        <w:pStyle w:val="Heading1"/>
+        <w:snapToGrid w:val="0"/>
+      </w:pPr>
+      <w:r>
+        <w:t>五 查看编辑与更新记忆</w:t>
+      </w:r>
+    </w:p>
+    <w:p>
+      <w:pPr>
+        <w:snapToGrid w:val="0"/>
+      </w:pPr>
+      <w:r>
+        <w:t>入口：DeepSeek 左侧“项目”旁的设置齿轮。页面左部是设置，中部选择个人或项目范围，右部按类别查看记忆。</w:t>
+      </w:r>
+    </w:p>
+    <w:p>
+      <w:pPr>
+        <w:keepNext/>
+        <w:spacing w:after="60" w:line="240" w:lineRule="auto"/>
+        <w:jc w:val="center"/>
+        <w:snapToGrid w:val="0"/>
+      </w:pPr>
+      <w:r>
+        <w:drawing>
+          <wp:inline xmlns:a="http://schemas.openxmlformats.org/drawingml/2006/main" xmlns:pic="http://schemas.openxmlformats.org/drawingml/2006/picture">
+            <wp:extent cx="5029200" cy="2558851"/>
+            <wp:docPr id="8" name="Picture 8" descr="图 8  先选择记忆范围，再查看类别和右上角的操作入口；账号信息已遮盖"/>
+            <wp:cNvGraphicFramePr>
+              <a:graphicFrameLocks noChangeAspect="1"/>
+            </wp:cNvGraphicFramePr>
+            <a:graphic>
+              <a:graphicData uri="http://schemas.openxmlformats.org/drawingml/2006/picture">
+                <pic:pic>
+                  <pic:nvPicPr>
+                    <pic:cNvPr id="0" name="manage.png"/>
+                    <pic:cNvPicPr/>
+                  </pic:nvPicPr>
+                  <pic:blipFill>
+                    <a:blip r:embed="rId17"/>
+                    <a:stretch>
+                      <a:fillRect/>
+                    </a:stretch>
+                  </pic:blipFill>
+                  <pic:spPr>
+                    <a:xfrm>
+                      <a:off x="0" y="0"/>
+                      <a:ext cx="5029200" cy="2558851"/>
+                    </a:xfrm>
+                    <a:prstGeom prst="rect"/>
+                  </pic:spPr>
+                </pic:pic>
+              </a:graphicData>
+            </a:graphic>
+          </wp:inline>
+        </w:drawing>
+      </w:r>
+    </w:p>
+    <w:p>
+      <w:pPr>
+        <w:pStyle w:val="Caption"/>
+        <w:jc w:val="center"/>
+        <w:snapToGrid w:val="0"/>
+      </w:pPr>
+      <w:r>
+        <w:t>图 8  先选择记忆范围，再查看类别和右上角的操作入口；账号信息已遮盖</w:t>
+      </w:r>
+    </w:p>
+    <w:p>
+      <w:pPr>
+        <w:pStyle w:val="Heading2"/>
+        <w:snapToGrid w:val="0"/>
+      </w:pPr>
+      <w:r>
+        <w:t>修改一类记忆</w:t>
+      </w:r>
+    </w:p>
+    <w:p>
+      <w:pPr>
+        <w:snapToGrid w:val="0"/>
+      </w:pPr>
+      <w:r>
+        <w:t>1. 选择“个人记忆”或具体项目，找到要修改的类别，点击“编辑”。</w:t>
+      </w:r>
+    </w:p>
+    <w:p>
+      <w:pPr>
+        <w:snapToGrid w:val="0"/>
+      </w:pPr>
+      <w:r>
+        <w:t>2. 每个输入框是一条记忆。可以修改正文，也可以在空白输入框新增内容。</w:t>
+      </w:r>
+    </w:p>
+    <w:p>
+      <w:pPr>
+        <w:snapToGrid w:val="0"/>
+      </w:pPr>
+      <w:r>
+        <w:t>3. 点击“保存类别”。清空已有条目后保存会删除该条，确认前核对提示。</w:t>
+      </w:r>
+    </w:p>
+    <w:p>
+      <w:pPr>
+        <w:snapToGrid w:val="0"/>
+      </w:pPr>
+      <w:r>
+        <w:t>人工新增或修改的条目会固定，自动整理不能改写、合并或删除这些固定条目。个人记忆独立压缩时会保留固定条目的 ID、类别和事实，可精简措辞。重要固定内容过多时，压缩可能失败，需要手动精简。</w:t>
+      </w:r>
+    </w:p>
+    <w:p>
+      <w:pPr>
+        <w:pStyle w:val="Heading2"/>
+        <w:snapToGrid w:val="0"/>
+      </w:pPr>
+      <w:r>
+        <w:t>更新记忆与整理当前会话</w:t>
+      </w:r>
+    </w:p>
+    <w:p>
+      <w:pPr>
+        <w:snapToGrid w:val="0"/>
+      </w:pPr>
+      <w:r>
+        <w:t>每轮回答完成后，插件自动处理已同步、历史完整且新增或变化的普通会话。个人和项目分别整理；未变化且已完成的版本不会重复发送。手动“更新记忆”会主动重整所选范围。</w:t>
+      </w:r>
+    </w:p>
+    <w:p>
+      <w:pPr>
+        <w:snapToGrid w:val="0"/>
+      </w:pPr>
+      <w:r>
+        <w:t>聊天输入区上方的“整理当前会话”只整理当前会话：项目会话整理该项目范围，未归类会话整理个人范围。需要更多旧会话参与时，先在网页中“加载更多会话”，并检查设置中的“起始时间”。</w:t>
+      </w:r>
+    </w:p>
+    <w:p>
+      <w:pPr>
+        <w:pStyle w:val="Heading2"/>
+        <w:snapToGrid w:val="0"/>
+      </w:pPr>
+      <w:r>
+        <w:t>删除与状态提示</w:t>
+      </w:r>
+    </w:p>
+    <w:p>
+      <w:pPr>
+        <w:snapToGrid w:val="0"/>
+      </w:pPr>
+      <w:r>
+        <w:t>在“更多”中选择“批量删除”，勾选当前范围的条目后删除；固定条目也可能被人工删除。删除不可撤销，先导出重要内容。显示“来源已变”“待确认”或“已停用”的条目不会按生效条目带入。</w:t>
+      </w:r>
+    </w:p>
+    <w:p>
+      <w:pPr>
+        <w:snapToGrid w:val="0"/>
+      </w:pPr>
+      <w:r>
+        <w:t>本地保留最近 5 份记忆快照，用于异常丢失后的自动恢复，不是手动回滚列表。主动删除会留下删除记录并清理快照中的对应内容，不应期待快照撤销人工删除。</w:t>
+      </w:r>
+    </w:p>
+    <w:p>
+      <w:pPr>
+        <w:snapToGrid w:val="0"/>
+      </w:pPr>
+      <w:r>
+        <w:br w:type="page"/>
+      </w:r>
+    </w:p>
+    <w:p>
+      <w:pPr>
+        <w:pStyle w:val="Heading1"/>
+        <w:snapToGrid w:val="0"/>
+      </w:pPr>
+      <w:r>
+        <w:t>六 导出备份与跨浏览器迁移</w:t>
+      </w:r>
+    </w:p>
+    <w:p>
+      <w:pPr>
+        <w:snapToGrid w:val="0"/>
+      </w:pPr>
+      <w:r>
+        <w:t>备份按记忆范围进行。导出的是记忆 JSON，不是完整会话记录、项目目录或全部插件设置；个人和各个项目需要分别导出。</w:t>
+      </w:r>
+    </w:p>
+    <w:p>
+      <w:pPr>
+        <w:pStyle w:val="Heading2"/>
+        <w:snapToGrid w:val="0"/>
+      </w:pPr>
+      <w:r>
+        <w:t>导出当前范围</w:t>
+      </w:r>
+    </w:p>
+    <w:p>
+      <w:pPr>
+        <w:snapToGrid w:val="0"/>
+      </w:pPr>
+      <w:r>
+        <w:t>1. 打开设置页，在记忆区域选择“个人记忆”或某个项目。</w:t>
+      </w:r>
+    </w:p>
+    <w:p>
+      <w:pPr>
+        <w:snapToGrid w:val="0"/>
+      </w:pPr>
+      <w:r>
+        <w:t>2. 点击右上角“更多”，选择“导出记忆”。</w:t>
+      </w:r>
+    </w:p>
+    <w:p>
+      <w:pPr>
+        <w:snapToGrid w:val="0"/>
+      </w:pPr>
+      <w:r>
+        <w:t>3. 保存下载的 JSON 文件。个人记忆文件名为 deepseek-personal-memories.json，项目记忆文件名为 deepseek-project-memories.json。</w:t>
+      </w:r>
+    </w:p>
+    <w:p>
+      <w:pPr>
+        <w:snapToGrid w:val="0"/>
+      </w:pPr>
+      <w:r>
+        <w:t>4. 逐个切换其他需要备份的范围并重复导出。多个项目的默认文件名相同，建议另存时加上项目名和日期。</w:t>
+      </w:r>
+    </w:p>
+    <w:p>
+      <w:pPr>
+        <w:pStyle w:val="Heading2"/>
+        <w:snapToGrid w:val="0"/>
+      </w:pPr>
+      <w:r>
+        <w:t>导入到目标浏览器</w:t>
+      </w:r>
+    </w:p>
+    <w:p>
+      <w:pPr>
+        <w:snapToGrid w:val="0"/>
+      </w:pPr>
+      <w:r>
+        <w:t>1. 在目标浏览器安装插件，打开 DeepSeek 并确认当前账号，再进入设置页。</w:t>
+      </w:r>
+    </w:p>
+    <w:p>
+      <w:pPr>
+        <w:snapToGrid w:val="0"/>
+      </w:pPr>
+      <w:r>
+        <w:t>2. 项目记忆导入前先建立对应项目。导入程序优先按项目 ID 匹配，再按项目名称匹配；未匹配项目的条目会跳过。</w:t>
+      </w:r>
+    </w:p>
+    <w:p>
+      <w:pPr>
+        <w:snapToGrid w:val="0"/>
+      </w:pPr>
+      <w:r>
+        <w:t>3. 点击“更多”→“导入记忆”，选择之前导出的 JSON，不选择 Word、源码 ZIP 或截图。</w:t>
+      </w:r>
+    </w:p>
+    <w:p>
+      <w:pPr>
+        <w:snapToGrid w:val="0"/>
+      </w:pPr>
+      <w:r>
+        <w:t>4. 核对预览中的重复 ID 和未映射项目数量。发现未映射项目时先取消，建立同名项目后重试。</w:t>
+      </w:r>
+    </w:p>
+    <w:p>
+      <w:pPr>
+        <w:snapToGrid w:val="0"/>
+      </w:pPr>
+      <w:r>
+        <w:t>5. 确认后查看“已导入”和“跳过”数量，再切换到对应记忆范围逐项核对。重复 memoryId 不会作为更新覆盖导入。</w:t>
+      </w:r>
+    </w:p>
+    <w:p>
+      <w:pPr>
+        <w:pStyle w:val="Heading2"/>
+        <w:snapToGrid w:val="0"/>
+      </w:pPr>
+      <w:r>
+        <w:t>迁移时需要知道</w:t>
+      </w:r>
+    </w:p>
+    <w:p>
+      <w:pPr>
+        <w:snapToGrid w:val="0"/>
+      </w:pPr>
+      <w:r>
+        <w:t>Chrome、Edge、Firefox 的扩展本地数据分别保存，不会自动互通。更换浏览器、浏览器配置文件、安装身份或电脑前，先完成记忆导出。导入会使用文件中的记忆范围及项目映射，不是把所有内容强制放入当前所选范围。</w:t>
+      </w:r>
+    </w:p>
+    <w:p>
+      <w:pPr>
+        <w:snapToGrid w:val="0"/>
+      </w:pPr>
+      <w:r>
+        <w:t>导入条目会作为人工固定记忆保存，之后仍可按类别编辑。个人记忆预算仍然适用，导入完成后应核对生效状态和内容，而不只查看导入条数。</w:t>
+      </w:r>
+    </w:p>
+    <w:p>
+      <w:pPr>
+        <w:pStyle w:val="Heading2"/>
+        <w:snapToGrid w:val="0"/>
+      </w:pPr>
+      <w:r>
+        <w:t>最小备份清单</w:t>
+      </w:r>
+    </w:p>
+    <w:tbl>
+      <w:tblPr>
+        <w:tblW w:type="auto" w:w="0"/>
+        <w:jc w:val="center"/>
+        <w:tblLayout w:type="fixed"/>
+        <w:tblLook w:firstColumn="1" w:firstRow="1" w:lastColumn="0" w:lastRow="0" w:noHBand="0" w:noVBand="1" w:val="04A0"/>
+      </w:tblPr>
+      <w:tblGrid>
+        <w:gridCol w:w="2948"/>
+        <w:gridCol w:w="6690"/>
+      </w:tblGrid>
+      <w:tr>
+        <w:trPr>
+          <w:cantSplit/>
+          <w:tblHeader/>
+        </w:trPr>
+        <w:tc>
+          <w:tcPr>
+            <w:tcW w:type="dxa" w:w="2948"/>
+            <w:vAlign w:val="center"/>
+            <w:tcBorders>
+              <w:top w:val="single" w:sz="4" w:color="D9D9D9"/>
+              <w:left w:val="single" w:sz="4" w:color="D9D9D9"/>
+              <w:bottom w:val="single" w:sz="4" w:color="D9D9D9"/>
+              <w:right w:val="single" w:sz="4" w:color="D9D9D9"/>
+            </w:tcBorders>
+            <w:tcMar>
+              <w:top w:w="95" w:type="dxa"/>
+              <w:left w:w="95" w:type="dxa"/>
+              <w:bottom w:w="95" w:type="dxa"/>
+              <w:right w:w="95" w:type="dxa"/>
+            </w:tcMar>
+            <w:shd w:fill="DCE8F3"/>
+          </w:tcPr>
+          <w:p>
+            <w:pPr>
+              <w:spacing w:after="40" w:line="260" w:lineRule="exact"/>
+              <w:snapToGrid w:val="0"/>
+            </w:pPr>
+            <w:r>
+              <w:rPr>
+                <w:b/>
+                <w:sz w:val="19"/>
+              </w:rPr>
+              <w:t>备份对象</w:t>
+            </w:r>
+          </w:p>
+        </w:tc>
+        <w:tc>
+          <w:tcPr>
+            <w:tcW w:type="dxa" w:w="6690"/>
+            <w:vAlign w:val="center"/>
+            <w:tcBorders>
+              <w:top w:val="single" w:sz="4" w:color="D9D9D9"/>
+              <w:left w:val="single" w:sz="4" w:color="D9D9D9"/>
+              <w:bottom w:val="single" w:sz="4" w:color="D9D9D9"/>
+              <w:right w:val="single" w:sz="4" w:color="D9D9D9"/>
+            </w:tcBorders>
+            <w:tcMar>
+              <w:top w:w="95" w:type="dxa"/>
+              <w:left w:w="95" w:type="dxa"/>
+              <w:bottom w:w="95" w:type="dxa"/>
+              <w:right w:w="95" w:type="dxa"/>
+            </w:tcMar>
+            <w:shd w:fill="DCE8F3"/>
+          </w:tcPr>
+          <w:p>
+            <w:pPr>
+              <w:spacing w:after="40" w:line="260" w:lineRule="exact"/>
+              <w:snapToGrid w:val="0"/>
+            </w:pPr>
+            <w:r>
+              <w:rPr>
+                <w:b/>
+                <w:sz w:val="19"/>
+              </w:rPr>
+              <w:t>操作</w:t>
+            </w:r>
+          </w:p>
+        </w:tc>
+      </w:tr>
+      <w:tr>
+        <w:trPr>
+          <w:cantSplit/>
+        </w:trPr>
+        <w:tc>
+          <w:tcPr>
+            <w:tcW w:type="dxa" w:w="2948"/>
+            <w:vAlign w:val="center"/>
+            <w:tcBorders>
+              <w:top w:val="single" w:sz="4" w:color="D9D9D9"/>
+              <w:left w:val="single" w:sz="4" w:color="D9D9D9"/>
+              <w:bottom w:val="single" w:sz="4" w:color="D9D9D9"/>
+              <w:right w:val="single" w:sz="4" w:color="D9D9D9"/>
+            </w:tcBorders>
+            <w:tcMar>
+              <w:top w:w="95" w:type="dxa"/>
+              <w:left w:w="95" w:type="dxa"/>
+              <w:bottom w:w="95" w:type="dxa"/>
+              <w:right w:w="95" w:type="dxa"/>
+            </w:tcMar>
+            <w:shd w:fill="FFFFFF"/>
+          </w:tcPr>
+          <w:p>
+            <w:pPr>
+              <w:spacing w:after="40" w:line="260" w:lineRule="exact"/>
+              <w:snapToGrid w:val="0"/>
+            </w:pPr>
+            <w:r>
+              <w:rPr>
+                <w:b w:val="0"/>
+                <w:sz w:val="19"/>
+              </w:rPr>
+              <w:t>通用偏好与工作习惯</w:t>
+            </w:r>
+          </w:p>
+        </w:tc>
+        <w:tc>
+          <w:tcPr>
+            <w:tcW w:type="dxa" w:w="6690"/>
+            <w:vAlign w:val="center"/>
+            <w:tcBorders>
+              <w:top w:val="single" w:sz="4" w:color="D9D9D9"/>
+              <w:left w:val="single" w:sz="4" w:color="D9D9D9"/>
+              <w:bottom w:val="single" w:sz="4" w:color="D9D9D9"/>
+              <w:right w:val="single" w:sz="4" w:color="D9D9D9"/>
+            </w:tcBorders>
+            <w:tcMar>
+              <w:top w:w="95" w:type="dxa"/>
+              <w:left w:w="95" w:type="dxa"/>
+              <w:bottom w:w="95" w:type="dxa"/>
+              <w:right w:w="95" w:type="dxa"/>
+            </w:tcMar>
+            <w:shd w:fill="FFFFFF"/>
+          </w:tcPr>
+          <w:p>
+            <w:pPr>
+              <w:spacing w:after="40" w:line="260" w:lineRule="exact"/>
+              <w:snapToGrid w:val="0"/>
+            </w:pPr>
+            <w:r>
+              <w:rPr>
+                <w:b w:val="0"/>
+                <w:sz w:val="19"/>
+              </w:rPr>
+              <w:t>选择个人记忆，导出一份 JSON。</w:t>
+            </w:r>
+          </w:p>
+        </w:tc>
+      </w:tr>
+      <w:tr>
+        <w:trPr>
+          <w:cantSplit/>
+        </w:trPr>
+        <w:tc>
+          <w:tcPr>
+            <w:tcW w:type="dxa" w:w="2948"/>
+            <w:vAlign w:val="center"/>
+            <w:tcBorders>
+              <w:top w:val="single" w:sz="4" w:color="D9D9D9"/>
+              <w:left w:val="single" w:sz="4" w:color="D9D9D9"/>
+              <w:bottom w:val="single" w:sz="4" w:color="D9D9D9"/>
+              <w:right w:val="single" w:sz="4" w:color="D9D9D9"/>
+            </w:tcBorders>
+            <w:tcMar>
+              <w:top w:w="95" w:type="dxa"/>
+              <w:left w:w="95" w:type="dxa"/>
+              <w:bottom w:w="95" w:type="dxa"/>
+              <w:right w:w="95" w:type="dxa"/>
+            </w:tcMar>
+            <w:shd w:fill="F5F8FB"/>
+          </w:tcPr>
+          <w:p>
+            <w:pPr>
+              <w:spacing w:after="40" w:line="260" w:lineRule="exact"/>
+              <w:snapToGrid w:val="0"/>
+            </w:pPr>
+            <w:r>
+              <w:rPr>
+                <w:b w:val="0"/>
+                <w:sz w:val="19"/>
+              </w:rPr>
+              <w:t>重要项目的决定与进度</w:t>
+            </w:r>
+          </w:p>
+        </w:tc>
+        <w:tc>
+          <w:tcPr>
+            <w:tcW w:type="dxa" w:w="6690"/>
+            <w:vAlign w:val="center"/>
+            <w:tcBorders>
+              <w:top w:val="single" w:sz="4" w:color="D9D9D9"/>
+              <w:left w:val="single" w:sz="4" w:color="D9D9D9"/>
+              <w:bottom w:val="single" w:sz="4" w:color="D9D9D9"/>
+              <w:right w:val="single" w:sz="4" w:color="D9D9D9"/>
+            </w:tcBorders>
+            <w:tcMar>
+              <w:top w:w="95" w:type="dxa"/>
+              <w:left w:w="95" w:type="dxa"/>
+              <w:bottom w:w="95" w:type="dxa"/>
+              <w:right w:w="95" w:type="dxa"/>
+            </w:tcMar>
+            <w:shd w:fill="F5F8FB"/>
+          </w:tcPr>
+          <w:p>
+            <w:pPr>
+              <w:spacing w:after="40" w:line="260" w:lineRule="exact"/>
+              <w:snapToGrid w:val="0"/>
+            </w:pPr>
+            <w:r>
+              <w:rPr>
+                <w:b w:val="0"/>
+                <w:sz w:val="19"/>
+              </w:rPr>
+              <w:t>逐个选择项目，分别导出并标注项目名。</w:t>
+            </w:r>
+          </w:p>
+        </w:tc>
+      </w:tr>
+      <w:tr>
+        <w:trPr>
+          <w:cantSplit/>
+        </w:trPr>
+        <w:tc>
+          <w:tcPr>
+            <w:tcW w:type="dxa" w:w="2948"/>
+            <w:vAlign w:val="center"/>
+            <w:tcBorders>
+              <w:top w:val="single" w:sz="4" w:color="D9D9D9"/>
+              <w:left w:val="single" w:sz="4" w:color="D9D9D9"/>
+              <w:bottom w:val="single" w:sz="4" w:color="D9D9D9"/>
+              <w:right w:val="single" w:sz="4" w:color="D9D9D9"/>
+            </w:tcBorders>
+            <w:tcMar>
+              <w:top w:w="95" w:type="dxa"/>
+              <w:left w:w="95" w:type="dxa"/>
+              <w:bottom w:w="95" w:type="dxa"/>
+              <w:right w:w="95" w:type="dxa"/>
+            </w:tcMar>
+            <w:shd w:fill="FFFFFF"/>
+          </w:tcPr>
+          <w:p>
+            <w:pPr>
+              <w:spacing w:after="40" w:line="260" w:lineRule="exact"/>
+              <w:snapToGrid w:val="0"/>
+            </w:pPr>
+            <w:r>
+              <w:rPr>
+                <w:b w:val="0"/>
+                <w:sz w:val="19"/>
+              </w:rPr>
+              <w:t>聊天原文及附件</w:t>
+            </w:r>
+          </w:p>
+        </w:tc>
+        <w:tc>
+          <w:tcPr>
+            <w:tcW w:type="dxa" w:w="6690"/>
+            <w:vAlign w:val="center"/>
+            <w:tcBorders>
+              <w:top w:val="single" w:sz="4" w:color="D9D9D9"/>
+              <w:left w:val="single" w:sz="4" w:color="D9D9D9"/>
+              <w:bottom w:val="single" w:sz="4" w:color="D9D9D9"/>
+              <w:right w:val="single" w:sz="4" w:color="D9D9D9"/>
+            </w:tcBorders>
+            <w:tcMar>
+              <w:top w:w="95" w:type="dxa"/>
+              <w:left w:w="95" w:type="dxa"/>
+              <w:bottom w:w="95" w:type="dxa"/>
+              <w:right w:w="95" w:type="dxa"/>
+            </w:tcMar>
+            <w:shd w:fill="FFFFFF"/>
+          </w:tcPr>
+          <w:p>
+            <w:pPr>
+              <w:spacing w:after="40" w:line="260" w:lineRule="exact"/>
+              <w:snapToGrid w:val="0"/>
+            </w:pPr>
+            <w:r>
+              <w:rPr>
+                <w:b w:val="0"/>
+                <w:sz w:val="19"/>
+              </w:rPr>
+              <w:t>不包含在记忆导出内，需要另外保存。</w:t>
+            </w:r>
+          </w:p>
+        </w:tc>
+      </w:tr>
+    </w:tbl>
+    <w:p>
+      <w:pPr>
+        <w:snapToGrid w:val="0"/>
+      </w:pPr>
+    </w:p>
+    <w:p>
+      <w:pPr>
+        <w:snapToGrid w:val="0"/>
+      </w:pPr>
+      <w:r>
+        <w:t>备份中可能包含个人资料与项目内容，请保存在合适的位置。清除扩展数据会清除本地记忆及快照，自动快照不能代替导出备份。</w:t>
+      </w:r>
+    </w:p>
+    <w:p>
+      <w:pPr>
+        <w:snapToGrid w:val="0"/>
+      </w:pPr>
+      <w:r>
+        <w:br w:type="page"/>
+      </w:r>
+    </w:p>
+    <w:p>
+      <w:pPr>
+        <w:pStyle w:val="Heading1"/>
+        <w:snapToGrid w:val="0"/>
+      </w:pPr>
+      <w:r>
+        <w:t>七 设置与长对话自动接续</w:t>
+      </w:r>
+    </w:p>
+    <w:p>
+      <w:pPr>
+        <w:snapToGrid w:val="0"/>
+      </w:pPr>
+      <w:r>
+        <w:t>首次使用建议保留默认上下文配置。下图是截图时的设置状态，不代表所有开关的默认状态。</w:t>
+      </w:r>
+    </w:p>
+    <w:p>
+      <w:pPr>
+        <w:keepNext/>
+        <w:spacing w:after="60" w:line="240" w:lineRule="auto"/>
+        <w:jc w:val="center"/>
+        <w:snapToGrid w:val="0"/>
+      </w:pPr>
+      <w:r>
+        <w:drawing>
+          <wp:inline xmlns:a="http://schemas.openxmlformats.org/drawingml/2006/main" xmlns:pic="http://schemas.openxmlformats.org/drawingml/2006/picture">
+            <wp:extent cx="5212080" cy="2777490"/>
+            <wp:docPr id="9" name="Picture 9" descr="图 9  设置页局部并排展示 上下文预算 记忆更新 聊天显示和队列"/>
+            <wp:cNvGraphicFramePr>
+              <a:graphicFrameLocks noChangeAspect="1"/>
+            </wp:cNvGraphicFramePr>
+            <a:graphic>
+              <a:graphicData uri="http://schemas.openxmlformats.org/drawingml/2006/picture">
+                <pic:pic>
+                  <pic:nvPicPr>
+                    <pic:cNvPr id="0" name="settings-panels.png"/>
+                    <pic:cNvPicPr/>
+                  </pic:nvPicPr>
+                  <pic:blipFill>
+                    <a:blip r:embed="rId18"/>
+                    <a:stretch>
+                      <a:fillRect/>
+                    </a:stretch>
+                  </pic:blipFill>
+                  <pic:spPr>
+                    <a:xfrm>
+                      <a:off x="0" y="0"/>
+                      <a:ext cx="5212080" cy="2777490"/>
+                    </a:xfrm>
+                    <a:prstGeom prst="rect"/>
+                  </pic:spPr>
+                </pic:pic>
+              </a:graphicData>
+            </a:graphic>
+          </wp:inline>
+        </w:drawing>
+      </w:r>
+    </w:p>
+    <w:p>
+      <w:pPr>
+        <w:pStyle w:val="Caption"/>
+        <w:jc w:val="center"/>
+        <w:snapToGrid w:val="0"/>
+      </w:pPr>
+      <w:r>
+        <w:t>图 9  设置页局部并排展示 上下文预算 记忆更新 聊天显示和队列</w:t>
+      </w:r>
+    </w:p>
+    <w:tbl>
+      <w:tblPr>
+        <w:tblW w:type="auto" w:w="0"/>
+        <w:jc w:val="center"/>
+        <w:tblLayout w:type="fixed"/>
+        <w:tblLook w:firstColumn="1" w:firstRow="1" w:lastColumn="0" w:lastRow="0" w:noHBand="0" w:noVBand="1" w:val="04A0"/>
+      </w:tblPr>
+      <w:tblGrid>
+        <w:gridCol w:w="2835"/>
+        <w:gridCol w:w="6803"/>
+      </w:tblGrid>
+      <w:tr>
+        <w:trPr>
+          <w:cantSplit/>
+          <w:tblHeader/>
+        </w:trPr>
+        <w:tc>
+          <w:tcPr>
+            <w:tcW w:type="dxa" w:w="2835"/>
+            <w:vAlign w:val="center"/>
+            <w:tcBorders>
+              <w:top w:val="single" w:sz="4" w:color="D9D9D9"/>
+              <w:left w:val="single" w:sz="4" w:color="D9D9D9"/>
+              <w:bottom w:val="single" w:sz="4" w:color="D9D9D9"/>
+              <w:right w:val="single" w:sz="4" w:color="D9D9D9"/>
+            </w:tcBorders>
+            <w:tcMar>
+              <w:top w:w="95" w:type="dxa"/>
+              <w:left w:w="95" w:type="dxa"/>
+              <w:bottom w:w="95" w:type="dxa"/>
+              <w:right w:w="95" w:type="dxa"/>
+            </w:tcMar>
+            <w:shd w:fill="DCE8F3"/>
+          </w:tcPr>
+          <w:p>
+            <w:pPr>
+              <w:spacing w:after="40" w:line="260" w:lineRule="exact"/>
+              <w:snapToGrid w:val="0"/>
+            </w:pPr>
+            <w:r>
+              <w:rPr>
+                <w:b/>
+                <w:sz w:val="19"/>
+              </w:rPr>
+              <w:t>设置项</w:t>
+            </w:r>
+          </w:p>
+        </w:tc>
+        <w:tc>
+          <w:tcPr>
+            <w:tcW w:type="dxa" w:w="6803"/>
+            <w:vAlign w:val="center"/>
+            <w:tcBorders>
+              <w:top w:val="single" w:sz="4" w:color="D9D9D9"/>
+              <w:left w:val="single" w:sz="4" w:color="D9D9D9"/>
+              <w:bottom w:val="single" w:sz="4" w:color="D9D9D9"/>
+              <w:right w:val="single" w:sz="4" w:color="D9D9D9"/>
+            </w:tcBorders>
+            <w:tcMar>
+              <w:top w:w="95" w:type="dxa"/>
+              <w:left w:w="95" w:type="dxa"/>
+              <w:bottom w:w="95" w:type="dxa"/>
+              <w:right w:w="95" w:type="dxa"/>
+            </w:tcMar>
+            <w:shd w:fill="DCE8F3"/>
+          </w:tcPr>
+          <w:p>
+            <w:pPr>
+              <w:spacing w:after="40" w:line="260" w:lineRule="exact"/>
+              <w:snapToGrid w:val="0"/>
+            </w:pPr>
+            <w:r>
+              <w:rPr>
+                <w:b/>
+                <w:sz w:val="19"/>
+              </w:rPr>
+              <w:t>作用与默认值</w:t>
+            </w:r>
+          </w:p>
+        </w:tc>
+      </w:tr>
+      <w:tr>
+        <w:trPr>
+          <w:cantSplit/>
+        </w:trPr>
+        <w:tc>
+          <w:tcPr>
+            <w:tcW w:type="dxa" w:w="2835"/>
+            <w:vAlign w:val="center"/>
+            <w:tcBorders>
+              <w:top w:val="single" w:sz="4" w:color="D9D9D9"/>
+              <w:left w:val="single" w:sz="4" w:color="D9D9D9"/>
+              <w:bottom w:val="single" w:sz="4" w:color="D9D9D9"/>
+              <w:right w:val="single" w:sz="4" w:color="D9D9D9"/>
+            </w:tcBorders>
+            <w:tcMar>
+              <w:top w:w="95" w:type="dxa"/>
+              <w:left w:w="95" w:type="dxa"/>
+              <w:bottom w:w="95" w:type="dxa"/>
+              <w:right w:w="95" w:type="dxa"/>
+            </w:tcMar>
+            <w:shd w:fill="FFFFFF"/>
+          </w:tcPr>
+          <w:p>
+            <w:pPr>
+              <w:spacing w:after="40" w:line="260" w:lineRule="exact"/>
+              <w:snapToGrid w:val="0"/>
+            </w:pPr>
+            <w:r>
+              <w:rPr>
+                <w:b w:val="0"/>
+                <w:sz w:val="19"/>
+              </w:rPr>
+              <w:t>切换会话预算</w:t>
+            </w:r>
+          </w:p>
+        </w:tc>
+        <w:tc>
+          <w:tcPr>
+            <w:tcW w:type="dxa" w:w="6803"/>
+            <w:vAlign w:val="center"/>
+            <w:tcBorders>
+              <w:top w:val="single" w:sz="4" w:color="D9D9D9"/>
+              <w:left w:val="single" w:sz="4" w:color="D9D9D9"/>
+              <w:bottom w:val="single" w:sz="4" w:color="D9D9D9"/>
+              <w:right w:val="single" w:sz="4" w:color="D9D9D9"/>
+            </w:tcBorders>
+            <w:tcMar>
+              <w:top w:w="95" w:type="dxa"/>
+              <w:left w:w="95" w:type="dxa"/>
+              <w:bottom w:w="95" w:type="dxa"/>
+              <w:right w:w="95" w:type="dxa"/>
+            </w:tcMar>
+            <w:shd w:fill="FFFFFF"/>
+          </w:tcPr>
+          <w:p>
+            <w:pPr>
+              <w:spacing w:after="40" w:line="260" w:lineRule="exact"/>
+              <w:snapToGrid w:val="0"/>
+            </w:pPr>
+            <w:r>
+              <w:rPr>
+                <w:b w:val="0"/>
+                <w:sz w:val="19"/>
+              </w:rPr>
+              <w:t>默认 256000 token，用作插件接续判断预算，不代表 DeepSeek 服务端承诺的上下文上限。</w:t>
+            </w:r>
+          </w:p>
+        </w:tc>
+      </w:tr>
+      <w:tr>
+        <w:trPr>
+          <w:cantSplit/>
+        </w:trPr>
+        <w:tc>
+          <w:tcPr>
+            <w:tcW w:type="dxa" w:w="2835"/>
+            <w:vAlign w:val="center"/>
+            <w:tcBorders>
+              <w:top w:val="single" w:sz="4" w:color="D9D9D9"/>
+              <w:left w:val="single" w:sz="4" w:color="D9D9D9"/>
+              <w:bottom w:val="single" w:sz="4" w:color="D9D9D9"/>
+              <w:right w:val="single" w:sz="4" w:color="D9D9D9"/>
+            </w:tcBorders>
+            <w:tcMar>
+              <w:top w:w="95" w:type="dxa"/>
+              <w:left w:w="95" w:type="dxa"/>
+              <w:bottom w:w="95" w:type="dxa"/>
+              <w:right w:w="95" w:type="dxa"/>
+            </w:tcMar>
+            <w:shd w:fill="F5F8FB"/>
+          </w:tcPr>
+          <w:p>
+            <w:pPr>
+              <w:spacing w:after="40" w:line="260" w:lineRule="exact"/>
+              <w:snapToGrid w:val="0"/>
+            </w:pPr>
+            <w:r>
+              <w:rPr>
+                <w:b w:val="0"/>
+                <w:sz w:val="19"/>
+              </w:rPr>
+              <w:t>接续提醒 与 回答预留</w:t>
+            </w:r>
+          </w:p>
+        </w:tc>
+        <w:tc>
+          <w:tcPr>
+            <w:tcW w:type="dxa" w:w="6803"/>
+            <w:vAlign w:val="center"/>
+            <w:tcBorders>
+              <w:top w:val="single" w:sz="4" w:color="D9D9D9"/>
+              <w:left w:val="single" w:sz="4" w:color="D9D9D9"/>
+              <w:bottom w:val="single" w:sz="4" w:color="D9D9D9"/>
+              <w:right w:val="single" w:sz="4" w:color="D9D9D9"/>
+            </w:tcBorders>
+            <w:tcMar>
+              <w:top w:w="95" w:type="dxa"/>
+              <w:left w:w="95" w:type="dxa"/>
+              <w:bottom w:w="95" w:type="dxa"/>
+              <w:right w:w="95" w:type="dxa"/>
+            </w:tcMar>
+            <w:shd w:fill="F5F8FB"/>
+          </w:tcPr>
+          <w:p>
+            <w:pPr>
+              <w:spacing w:after="40" w:line="260" w:lineRule="exact"/>
+              <w:snapToGrid w:val="0"/>
+            </w:pPr>
+            <w:r>
+              <w:rPr>
+                <w:b w:val="0"/>
+                <w:sz w:val="19"/>
+              </w:rPr>
+              <w:t>默认 100% 和 4000 token；调低提醒比例会更早达到接续条件。</w:t>
+            </w:r>
+          </w:p>
+        </w:tc>
+      </w:tr>
+      <w:tr>
+        <w:trPr>
+          <w:cantSplit/>
+        </w:trPr>
+        <w:tc>
+          <w:tcPr>
+            <w:tcW w:type="dxa" w:w="2835"/>
+            <w:vAlign w:val="center"/>
+            <w:tcBorders>
+              <w:top w:val="single" w:sz="4" w:color="D9D9D9"/>
+              <w:left w:val="single" w:sz="4" w:color="D9D9D9"/>
+              <w:bottom w:val="single" w:sz="4" w:color="D9D9D9"/>
+              <w:right w:val="single" w:sz="4" w:color="D9D9D9"/>
+            </w:tcBorders>
+            <w:tcMar>
+              <w:top w:w="95" w:type="dxa"/>
+              <w:left w:w="95" w:type="dxa"/>
+              <w:bottom w:w="95" w:type="dxa"/>
+              <w:right w:w="95" w:type="dxa"/>
+            </w:tcMar>
+            <w:shd w:fill="FFFFFF"/>
+          </w:tcPr>
+          <w:p>
+            <w:pPr>
+              <w:spacing w:after="40" w:line="260" w:lineRule="exact"/>
+              <w:snapToGrid w:val="0"/>
+            </w:pPr>
+            <w:r>
+              <w:rPr>
+                <w:b w:val="0"/>
+                <w:sz w:val="19"/>
+              </w:rPr>
+              <w:t>默认带入项目记忆</w:t>
+            </w:r>
+          </w:p>
+        </w:tc>
+        <w:tc>
+          <w:tcPr>
+            <w:tcW w:type="dxa" w:w="6803"/>
+            <w:vAlign w:val="center"/>
+            <w:tcBorders>
+              <w:top w:val="single" w:sz="4" w:color="D9D9D9"/>
+              <w:left w:val="single" w:sz="4" w:color="D9D9D9"/>
+              <w:bottom w:val="single" w:sz="4" w:color="D9D9D9"/>
+              <w:right w:val="single" w:sz="4" w:color="D9D9D9"/>
+            </w:tcBorders>
+            <w:tcMar>
+              <w:top w:w="95" w:type="dxa"/>
+              <w:left w:w="95" w:type="dxa"/>
+              <w:bottom w:w="95" w:type="dxa"/>
+              <w:right w:w="95" w:type="dxa"/>
+            </w:tcMar>
+            <w:shd w:fill="FFFFFF"/>
+          </w:tcPr>
+          <w:p>
+            <w:pPr>
+              <w:spacing w:after="40" w:line="260" w:lineRule="exact"/>
+              <w:snapToGrid w:val="0"/>
+            </w:pPr>
+            <w:r>
+              <w:rPr>
+                <w:b w:val="0"/>
+                <w:sz w:val="19"/>
+              </w:rPr>
+              <w:t>默认关闭；控制新会话的项目记忆默认行为，仍需先确定项目。</w:t>
+            </w:r>
+          </w:p>
+        </w:tc>
+      </w:tr>
+      <w:tr>
+        <w:trPr>
+          <w:cantSplit/>
+        </w:trPr>
+        <w:tc>
+          <w:tcPr>
+            <w:tcW w:type="dxa" w:w="2835"/>
+            <w:vAlign w:val="center"/>
+            <w:tcBorders>
+              <w:top w:val="single" w:sz="4" w:color="D9D9D9"/>
+              <w:left w:val="single" w:sz="4" w:color="D9D9D9"/>
+              <w:bottom w:val="single" w:sz="4" w:color="D9D9D9"/>
+              <w:right w:val="single" w:sz="4" w:color="D9D9D9"/>
+            </w:tcBorders>
+            <w:tcMar>
+              <w:top w:w="95" w:type="dxa"/>
+              <w:left w:w="95" w:type="dxa"/>
+              <w:bottom w:w="95" w:type="dxa"/>
+              <w:right w:w="95" w:type="dxa"/>
+            </w:tcMar>
+            <w:shd w:fill="F5F8FB"/>
+          </w:tcPr>
+          <w:p>
+            <w:pPr>
+              <w:spacing w:after="40" w:line="260" w:lineRule="exact"/>
+              <w:snapToGrid w:val="0"/>
+            </w:pPr>
+            <w:r>
+              <w:rPr>
+                <w:b w:val="0"/>
+                <w:sz w:val="19"/>
+              </w:rPr>
+              <w:t>起始时间</w:t>
+            </w:r>
+          </w:p>
+        </w:tc>
+        <w:tc>
+          <w:tcPr>
+            <w:tcW w:type="dxa" w:w="6803"/>
+            <w:vAlign w:val="center"/>
+            <w:tcBorders>
+              <w:top w:val="single" w:sz="4" w:color="D9D9D9"/>
+              <w:left w:val="single" w:sz="4" w:color="D9D9D9"/>
+              <w:bottom w:val="single" w:sz="4" w:color="D9D9D9"/>
+              <w:right w:val="single" w:sz="4" w:color="D9D9D9"/>
+            </w:tcBorders>
+            <w:tcMar>
+              <w:top w:w="95" w:type="dxa"/>
+              <w:left w:w="95" w:type="dxa"/>
+              <w:bottom w:w="95" w:type="dxa"/>
+              <w:right w:w="95" w:type="dxa"/>
+            </w:tcMar>
+            <w:shd w:fill="F5F8FB"/>
+          </w:tcPr>
+          <w:p>
+            <w:pPr>
+              <w:spacing w:after="40" w:line="260" w:lineRule="exact"/>
+              <w:snapToGrid w:val="0"/>
+            </w:pPr>
+            <w:r>
+              <w:rPr>
+                <w:b w:val="0"/>
+                <w:sz w:val="19"/>
+              </w:rPr>
+              <w:t>默认从插件首次运行开始；按会话创建时间筛选，修改不删除已有记忆。</w:t>
+            </w:r>
+          </w:p>
+        </w:tc>
+      </w:tr>
+      <w:tr>
+        <w:trPr>
+          <w:cantSplit/>
+        </w:trPr>
+        <w:tc>
+          <w:tcPr>
+            <w:tcW w:type="dxa" w:w="2835"/>
+            <w:vAlign w:val="center"/>
+            <w:tcBorders>
+              <w:top w:val="single" w:sz="4" w:color="D9D9D9"/>
+              <w:left w:val="single" w:sz="4" w:color="D9D9D9"/>
+              <w:bottom w:val="single" w:sz="4" w:color="D9D9D9"/>
+              <w:right w:val="single" w:sz="4" w:color="D9D9D9"/>
+            </w:tcBorders>
+            <w:tcMar>
+              <w:top w:w="95" w:type="dxa"/>
+              <w:left w:w="95" w:type="dxa"/>
+              <w:bottom w:w="95" w:type="dxa"/>
+              <w:right w:w="95" w:type="dxa"/>
+            </w:tcMar>
+            <w:shd w:fill="FFFFFF"/>
+          </w:tcPr>
+          <w:p>
+            <w:pPr>
+              <w:spacing w:after="40" w:line="260" w:lineRule="exact"/>
+              <w:snapToGrid w:val="0"/>
+            </w:pPr>
+            <w:r>
+              <w:rPr>
+                <w:b w:val="0"/>
+                <w:sz w:val="19"/>
+              </w:rPr>
+              <w:t>聊天显示</w:t>
+            </w:r>
+          </w:p>
+        </w:tc>
+        <w:tc>
+          <w:tcPr>
+            <w:tcW w:type="dxa" w:w="6803"/>
+            <w:vAlign w:val="center"/>
+            <w:tcBorders>
+              <w:top w:val="single" w:sz="4" w:color="D9D9D9"/>
+              <w:left w:val="single" w:sz="4" w:color="D9D9D9"/>
+              <w:bottom w:val="single" w:sz="4" w:color="D9D9D9"/>
+              <w:right w:val="single" w:sz="4" w:color="D9D9D9"/>
+            </w:tcBorders>
+            <w:tcMar>
+              <w:top w:w="95" w:type="dxa"/>
+              <w:left w:w="95" w:type="dxa"/>
+              <w:bottom w:w="95" w:type="dxa"/>
+              <w:right w:w="95" w:type="dxa"/>
+            </w:tcMar>
+            <w:shd w:fill="FFFFFF"/>
+          </w:tcPr>
+          <w:p>
+            <w:pPr>
+              <w:spacing w:after="40" w:line="260" w:lineRule="exact"/>
+              <w:snapToGrid w:val="0"/>
+            </w:pPr>
+            <w:r>
+              <w:rPr>
+                <w:b w:val="0"/>
+                <w:sz w:val="19"/>
+              </w:rPr>
+              <w:t>个人和项目记忆默认隐藏；消息 token 与时间、自动化会话分组默认显示。</w:t>
+            </w:r>
+          </w:p>
+        </w:tc>
+      </w:tr>
+    </w:tbl>
+    <w:p>
+      <w:pPr>
+        <w:snapToGrid w:val="0"/>
+      </w:pPr>
+    </w:p>
+    <w:p>
+      <w:pPr>
+        <w:snapToGrid w:val="0"/>
+      </w:pPr>
+      <w:r>
+        <w:t>开启项目记忆后，插件在发送前结合历史上下文用量、本轮文字和回答预留判断是否达到预算。达到时，在同项目的新会话中发送本轮问题、适用记忆和近期进展。确认目标收到后才清空匹配的原草稿；异常时保留输入供核对。</w:t>
+      </w:r>
+    </w:p>
+    <w:p>
+      <w:pPr>
+        <w:snapToGrid w:val="0"/>
+      </w:pPr>
+      <w:r>
+        <w:t>显示开关只控制可见性，不停止学习或发送记忆。项目会话的 token 与时间可在消息下方显示，附件卡片独立保留。不要为了体验功能故意制造超长对话。</w:t>
+      </w:r>
+    </w:p>
+    <w:p>
+      <w:pPr>
+        <w:snapToGrid w:val="0"/>
+      </w:pPr>
+      <w:r>
+        <w:br w:type="page"/>
+      </w:r>
+    </w:p>
+    <w:p>
+      <w:pPr>
+        <w:pStyle w:val="Heading1"/>
+        <w:snapToGrid w:val="0"/>
+      </w:pPr>
+      <w:r>
+        <w:t>八 自动化队列与辅助会话</w:t>
+      </w:r>
+    </w:p>
+    <w:p>
+      <w:pPr>
+        <w:snapToGrid w:val="0"/>
+      </w:pPr>
+      <w:r>
+        <w:t>整理、压缩和接续会通过网页执行自动化任务。辅助标签页出现时，可在设置页查看进度，不必把自动化对话当作项目工作会话。</w:t>
+      </w:r>
+    </w:p>
+    <w:p>
+      <w:pPr>
+        <w:keepNext/>
+        <w:spacing w:after="60" w:line="240" w:lineRule="auto"/>
+        <w:jc w:val="center"/>
+        <w:snapToGrid w:val="0"/>
+      </w:pPr>
+      <w:r>
+        <w:drawing>
+          <wp:inline xmlns:a="http://schemas.openxmlformats.org/drawingml/2006/main" xmlns:pic="http://schemas.openxmlformats.org/drawingml/2006/picture">
+            <wp:extent cx="5760720" cy="1953348"/>
+            <wp:docPr id="10" name="Picture 10" descr="图 10  记忆整理产生的辅助会话收纳在“自动化会话”分组中"/>
+            <wp:cNvGraphicFramePr>
+              <a:graphicFrameLocks noChangeAspect="1"/>
+            </wp:cNvGraphicFramePr>
+            <a:graphic>
+              <a:graphicData uri="http://schemas.openxmlformats.org/drawingml/2006/picture">
+                <pic:pic>
+                  <pic:nvPicPr>
+                    <pic:cNvPr id="0" name="automation.png"/>
+                    <pic:cNvPicPr/>
+                  </pic:nvPicPr>
+                  <pic:blipFill>
+                    <a:blip r:embed="rId19"/>
+                    <a:stretch>
+                      <a:fillRect/>
+                    </a:stretch>
+                  </pic:blipFill>
+                  <pic:spPr>
+                    <a:xfrm>
+                      <a:off x="0" y="0"/>
+                      <a:ext cx="5760720" cy="1953348"/>
+                    </a:xfrm>
+                    <a:prstGeom prst="rect"/>
+                  </pic:spPr>
+                </pic:pic>
+              </a:graphicData>
+            </a:graphic>
+          </wp:inline>
+        </w:drawing>
+      </w:r>
+    </w:p>
+    <w:p>
+      <w:pPr>
+        <w:pStyle w:val="Caption"/>
+        <w:jc w:val="center"/>
+        <w:snapToGrid w:val="0"/>
+      </w:pPr>
+      <w:r>
+        <w:t>图 10  记忆整理产生的辅助会话收纳在“自动化会话”分组中</w:t>
+      </w:r>
+    </w:p>
+    <w:p>
+      <w:pPr>
+        <w:pStyle w:val="Heading2"/>
+        <w:snapToGrid w:val="0"/>
+      </w:pPr>
+      <w:r>
+        <w:t>查看暂停与重试</w:t>
+      </w:r>
+    </w:p>
+    <w:p>
+      <w:pPr>
+        <w:snapToGrid w:val="0"/>
+      </w:pPr>
+      <w:r>
+        <w:t>1. 打开设置页“自动化队列”，查看执行中、等待和需要处理的任务。任务按顺序执行。</w:t>
+      </w:r>
+    </w:p>
+    <w:p>
+      <w:pPr>
+        <w:snapToGrid w:val="0"/>
+      </w:pPr>
+      <w:r>
+        <w:t>2. 需要暂缓时点击“暂停队列”，恢复时点击“继续队列”。暂停队列不会清除已保存记忆，也不等于禁止普通原生聊天。</w:t>
+      </w:r>
+    </w:p>
+    <w:p>
+      <w:pPr>
+        <w:snapToGrid w:val="0"/>
+      </w:pPr>
+      <w:r>
+        <w:t>3. 任务失败或结果不明时，查看“需要核对的任务”。先检查 DeepSeek 目标会话与保留草稿，再决定重试、忽略或取消，避免重复发送。</w:t>
+      </w:r>
+    </w:p>
+    <w:p>
+      <w:pPr>
+        <w:snapToGrid w:val="0"/>
+      </w:pPr>
+      <w:r>
+        <w:t>4. 如果页面提示站点请求限制，先确认 DeepSeek 原生聊天恢复，再使用“已确认限制解除，恢复任务”。</w:t>
+      </w:r>
+    </w:p>
+    <w:p>
+      <w:pPr>
+        <w:pStyle w:val="Heading2"/>
+        <w:snapToGrid w:val="0"/>
+      </w:pPr>
+      <w:r>
+        <w:t>完成和超时规则</w:t>
+      </w:r>
+    </w:p>
+    <w:p>
+      <w:pPr>
+        <w:snapToGrid w:val="0"/>
+      </w:pPr>
+      <w:r>
+        <w:t>记忆任务从开始执行起超过 30 秒未完成会跳过，并关闭辅助标签页，继续后续任务；排队时间不计入。插件每 5 秒核对辅助会话历史，确认回答为完成状态后才校验和保存。已有记忆在失败或超时时保留，迟到结果不会写入。</w:t>
+      </w:r>
+    </w:p>
+    <w:p>
+      <w:pPr>
+        <w:snapToGrid w:val="0"/>
+      </w:pPr>
+      <w:r>
+        <w:t>长对话接续使用单独的等待流程：每 30 秒核对后继会话并回报心跳，只有明确完成的回答才结束任务。不能把记忆整理的 30 秒时限套用到所有接续任务。</w:t>
+      </w:r>
+    </w:p>
+    <w:p>
+      <w:pPr>
+        <w:pStyle w:val="Heading2"/>
+        <w:snapToGrid w:val="0"/>
+      </w:pPr>
+      <w:r>
+        <w:t>自动化会话的显示和清理</w:t>
+      </w:r>
+    </w:p>
+    <w:p>
+      <w:pPr>
+        <w:snapToGrid w:val="0"/>
+      </w:pPr>
+      <w:r>
+        <w:t>侧边栏分组每次打开页面默认收起，展开显示最近 5 条；插件生成的辅助会话保留最近 10 条，符合条件的更早辅助记录会从 DeepSeek 删除。手动收纳、来源不明及运行任务关联记录受保护。显示条数与保留条数是不同规则。</w:t>
+      </w:r>
+    </w:p>
+    <w:p>
+      <w:pPr>
+        <w:snapToGrid w:val="0"/>
+      </w:pPr>
+      <w:r>
+        <w:t>隐藏“显示侧边栏自动化会话”只隐藏分组，不会暂停任务。未归类会话菜单中的“收纳到自动化会话”用于手动整理，也可恢复为普通会话。</w:t>
+      </w:r>
+    </w:p>
+    <w:p>
+      <w:pPr>
+        <w:snapToGrid w:val="0"/>
+      </w:pPr>
+      <w:r>
+        <w:br w:type="page"/>
+      </w:r>
+    </w:p>
+    <w:p>
+      <w:pPr>
+        <w:pStyle w:val="Heading1"/>
+        <w:snapToGrid w:val="0"/>
+      </w:pPr>
+      <w:r>
+        <w:t>九 更新插件与排查问题</w:t>
+      </w:r>
+    </w:p>
+    <w:p>
+      <w:pPr>
+        <w:pStyle w:val="Heading2"/>
+        <w:snapToGrid w:val="0"/>
+      </w:pPr>
+      <w:r>
+        <w:t>更新已安装的扩展</w:t>
+      </w:r>
+    </w:p>
+    <w:p>
+      <w:pPr>
+        <w:snapToGrid w:val="0"/>
+      </w:pPr>
+      <w:r>
+        <w:t>1. 先分别导出重要个人记忆和项目记忆。</w:t>
+      </w:r>
+    </w:p>
+    <w:p>
+      <w:pPr>
+        <w:snapToGrid w:val="0"/>
+      </w:pPr>
+      <w:r>
+        <w:t>2. 源码安装把新文件放回原目录；使用 Git 的用户在仓库中执行 git pull --ff-only。</w:t>
+      </w:r>
+    </w:p>
+    <w:p>
+      <w:pPr>
+        <w:snapToGrid w:val="0"/>
+      </w:pPr>
+      <w:r>
+        <w:t>3. Chrome／Edge 在扩展管理页重新加载插件；Firefox 临时加载在调试页重新载入，商店安装按浏览器的附加组件更新流程操作。</w:t>
+      </w:r>
+    </w:p>
+    <w:p>
+      <w:pPr>
+        <w:snapToGrid w:val="0"/>
+      </w:pPr>
+      <w:r>
+        <w:t>4. 刷新 DeepSeek 页面，确认项目区域与记忆内容。正常更新不必卸载扩展。</w:t>
+      </w:r>
+    </w:p>
+    <w:p>
+      <w:pPr>
+        <w:pStyle w:val="Heading2"/>
+        <w:snapToGrid w:val="0"/>
+      </w:pPr>
+      <w:r>
+        <w:t>按现象定位</w:t>
+      </w:r>
+    </w:p>
+    <w:tbl>
+      <w:tblPr>
+        <w:tblW w:type="auto" w:w="0"/>
+        <w:jc w:val="center"/>
+        <w:tblLayout w:type="fixed"/>
+        <w:tblLook w:firstColumn="1" w:firstRow="1" w:lastColumn="0" w:lastRow="0" w:noHBand="0" w:noVBand="1" w:val="04A0"/>
+      </w:tblPr>
+      <w:tblGrid>
+        <w:gridCol w:w="2608"/>
+        <w:gridCol w:w="7030"/>
+      </w:tblGrid>
+      <w:tr>
+        <w:trPr>
+          <w:cantSplit/>
+          <w:tblHeader/>
+        </w:trPr>
+        <w:tc>
+          <w:tcPr>
+            <w:tcW w:type="dxa" w:w="2608"/>
+            <w:vAlign w:val="center"/>
+            <w:tcBorders>
+              <w:top w:val="single" w:sz="4" w:color="D9D9D9"/>
+              <w:left w:val="single" w:sz="4" w:color="D9D9D9"/>
+              <w:bottom w:val="single" w:sz="4" w:color="D9D9D9"/>
+              <w:right w:val="single" w:sz="4" w:color="D9D9D9"/>
+            </w:tcBorders>
+            <w:tcMar>
+              <w:top w:w="95" w:type="dxa"/>
+              <w:left w:w="95" w:type="dxa"/>
+              <w:bottom w:w="95" w:type="dxa"/>
+              <w:right w:w="95" w:type="dxa"/>
+            </w:tcMar>
+            <w:shd w:fill="DCE8F3"/>
+          </w:tcPr>
+          <w:p>
+            <w:pPr>
+              <w:spacing w:after="40" w:line="260" w:lineRule="exact"/>
+              <w:snapToGrid w:val="0"/>
+            </w:pPr>
+            <w:r>
+              <w:rPr>
+                <w:b/>
+                <w:sz w:val="19"/>
+              </w:rPr>
+              <w:t>现象</w:t>
+            </w:r>
+          </w:p>
+        </w:tc>
+        <w:tc>
+          <w:tcPr>
+            <w:tcW w:type="dxa" w:w="7030"/>
+            <w:vAlign w:val="center"/>
+            <w:tcBorders>
+              <w:top w:val="single" w:sz="4" w:color="D9D9D9"/>
+              <w:left w:val="single" w:sz="4" w:color="D9D9D9"/>
+              <w:bottom w:val="single" w:sz="4" w:color="D9D9D9"/>
+              <w:right w:val="single" w:sz="4" w:color="D9D9D9"/>
+            </w:tcBorders>
+            <w:tcMar>
+              <w:top w:w="95" w:type="dxa"/>
+              <w:left w:w="95" w:type="dxa"/>
+              <w:bottom w:w="95" w:type="dxa"/>
+              <w:right w:w="95" w:type="dxa"/>
+            </w:tcMar>
+            <w:shd w:fill="DCE8F3"/>
+          </w:tcPr>
+          <w:p>
+            <w:pPr>
+              <w:spacing w:after="40" w:line="260" w:lineRule="exact"/>
+              <w:snapToGrid w:val="0"/>
+            </w:pPr>
+            <w:r>
+              <w:rPr>
+                <w:b/>
+                <w:sz w:val="19"/>
+              </w:rPr>
+              <w:t>检查与处理</w:t>
+            </w:r>
+          </w:p>
+        </w:tc>
+      </w:tr>
+      <w:tr>
+        <w:trPr>
+          <w:cantSplit/>
+        </w:trPr>
+        <w:tc>
+          <w:tcPr>
+            <w:tcW w:type="dxa" w:w="2608"/>
+            <w:vAlign w:val="center"/>
+            <w:tcBorders>
+              <w:top w:val="single" w:sz="4" w:color="D9D9D9"/>
+              <w:left w:val="single" w:sz="4" w:color="D9D9D9"/>
+              <w:bottom w:val="single" w:sz="4" w:color="D9D9D9"/>
+              <w:right w:val="single" w:sz="4" w:color="D9D9D9"/>
+            </w:tcBorders>
+            <w:tcMar>
+              <w:top w:w="95" w:type="dxa"/>
+              <w:left w:w="95" w:type="dxa"/>
+              <w:bottom w:w="95" w:type="dxa"/>
+              <w:right w:w="95" w:type="dxa"/>
+            </w:tcMar>
+            <w:shd w:fill="FFFFFF"/>
+          </w:tcPr>
+          <w:p>
+            <w:pPr>
+              <w:spacing w:after="40" w:line="260" w:lineRule="exact"/>
+              <w:snapToGrid w:val="0"/>
+            </w:pPr>
+            <w:r>
+              <w:rPr>
+                <w:b w:val="0"/>
+                <w:sz w:val="19"/>
+              </w:rPr>
+              <w:t>页面没有项目区域</w:t>
+            </w:r>
+          </w:p>
+        </w:tc>
+        <w:tc>
+          <w:tcPr>
+            <w:tcW w:type="dxa" w:w="7030"/>
+            <w:vAlign w:val="center"/>
+            <w:tcBorders>
+              <w:top w:val="single" w:sz="4" w:color="D9D9D9"/>
+              <w:left w:val="single" w:sz="4" w:color="D9D9D9"/>
+              <w:bottom w:val="single" w:sz="4" w:color="D9D9D9"/>
+              <w:right w:val="single" w:sz="4" w:color="D9D9D9"/>
+            </w:tcBorders>
+            <w:tcMar>
+              <w:top w:w="95" w:type="dxa"/>
+              <w:left w:w="95" w:type="dxa"/>
+              <w:bottom w:w="95" w:type="dxa"/>
+              <w:right w:w="95" w:type="dxa"/>
+            </w:tcMar>
+            <w:shd w:fill="FFFFFF"/>
+          </w:tcPr>
+          <w:p>
+            <w:pPr>
+              <w:spacing w:after="40" w:line="260" w:lineRule="exact"/>
+              <w:snapToGrid w:val="0"/>
+            </w:pPr>
+            <w:r>
+              <w:rPr>
+                <w:b w:val="0"/>
+                <w:sz w:val="19"/>
+              </w:rPr>
+              <w:t>核对扩展已启用、站点为 chat.deepseek.com、站点访问权限已授予，然后刷新。</w:t>
+            </w:r>
+          </w:p>
+        </w:tc>
+      </w:tr>
+      <w:tr>
+        <w:trPr>
+          <w:cantSplit/>
+        </w:trPr>
+        <w:tc>
+          <w:tcPr>
+            <w:tcW w:type="dxa" w:w="2608"/>
+            <w:vAlign w:val="center"/>
+            <w:tcBorders>
+              <w:top w:val="single" w:sz="4" w:color="D9D9D9"/>
+              <w:left w:val="single" w:sz="4" w:color="D9D9D9"/>
+              <w:bottom w:val="single" w:sz="4" w:color="D9D9D9"/>
+              <w:right w:val="single" w:sz="4" w:color="D9D9D9"/>
+            </w:tcBorders>
+            <w:tcMar>
+              <w:top w:w="95" w:type="dxa"/>
+              <w:left w:w="95" w:type="dxa"/>
+              <w:bottom w:w="95" w:type="dxa"/>
+              <w:right w:w="95" w:type="dxa"/>
+            </w:tcMar>
+            <w:shd w:fill="F5F8FB"/>
+          </w:tcPr>
+          <w:p>
+            <w:pPr>
+              <w:spacing w:after="40" w:line="260" w:lineRule="exact"/>
+              <w:snapToGrid w:val="0"/>
+            </w:pPr>
+            <w:r>
+              <w:rPr>
+                <w:b w:val="0"/>
+                <w:sz w:val="19"/>
+              </w:rPr>
+              <w:t>项目记忆没有带入</w:t>
+            </w:r>
+          </w:p>
+        </w:tc>
+        <w:tc>
+          <w:tcPr>
+            <w:tcW w:type="dxa" w:w="7030"/>
+            <w:vAlign w:val="center"/>
+            <w:tcBorders>
+              <w:top w:val="single" w:sz="4" w:color="D9D9D9"/>
+              <w:left w:val="single" w:sz="4" w:color="D9D9D9"/>
+              <w:bottom w:val="single" w:sz="4" w:color="D9D9D9"/>
+              <w:right w:val="single" w:sz="4" w:color="D9D9D9"/>
+            </w:tcBorders>
+            <w:tcMar>
+              <w:top w:w="95" w:type="dxa"/>
+              <w:left w:w="95" w:type="dxa"/>
+              <w:bottom w:w="95" w:type="dxa"/>
+              <w:right w:w="95" w:type="dxa"/>
+            </w:tcMar>
+            <w:shd w:fill="F5F8FB"/>
+          </w:tcPr>
+          <w:p>
+            <w:pPr>
+              <w:spacing w:after="40" w:line="260" w:lineRule="exact"/>
+              <w:snapToGrid w:val="0"/>
+            </w:pPr>
+            <w:r>
+              <w:rPr>
+                <w:b w:val="0"/>
+                <w:sz w:val="19"/>
+              </w:rPr>
+              <w:t>核对选中的项目和项目记忆开关。中途开启不补发；在该项目中新建会话发送首条文字。</w:t>
+            </w:r>
+          </w:p>
+        </w:tc>
+      </w:tr>
+      <w:tr>
+        <w:trPr>
+          <w:cantSplit/>
+        </w:trPr>
+        <w:tc>
+          <w:tcPr>
+            <w:tcW w:type="dxa" w:w="2608"/>
+            <w:vAlign w:val="center"/>
+            <w:tcBorders>
+              <w:top w:val="single" w:sz="4" w:color="D9D9D9"/>
+              <w:left w:val="single" w:sz="4" w:color="D9D9D9"/>
+              <w:bottom w:val="single" w:sz="4" w:color="D9D9D9"/>
+              <w:right w:val="single" w:sz="4" w:color="D9D9D9"/>
+            </w:tcBorders>
+            <w:tcMar>
+              <w:top w:w="95" w:type="dxa"/>
+              <w:left w:w="95" w:type="dxa"/>
+              <w:bottom w:w="95" w:type="dxa"/>
+              <w:right w:w="95" w:type="dxa"/>
+            </w:tcMar>
+            <w:shd w:fill="FFFFFF"/>
+          </w:tcPr>
+          <w:p>
+            <w:pPr>
+              <w:spacing w:after="40" w:line="260" w:lineRule="exact"/>
+              <w:snapToGrid w:val="0"/>
+            </w:pPr>
+            <w:r>
+              <w:rPr>
+                <w:b w:val="0"/>
+                <w:sz w:val="19"/>
+              </w:rPr>
+              <w:t>隐藏记忆后仍像记得背景</w:t>
+            </w:r>
+          </w:p>
+        </w:tc>
+        <w:tc>
+          <w:tcPr>
+            <w:tcW w:type="dxa" w:w="7030"/>
+            <w:vAlign w:val="center"/>
+            <w:tcBorders>
+              <w:top w:val="single" w:sz="4" w:color="D9D9D9"/>
+              <w:left w:val="single" w:sz="4" w:color="D9D9D9"/>
+              <w:bottom w:val="single" w:sz="4" w:color="D9D9D9"/>
+              <w:right w:val="single" w:sz="4" w:color="D9D9D9"/>
+            </w:tcBorders>
+            <w:tcMar>
+              <w:top w:w="95" w:type="dxa"/>
+              <w:left w:w="95" w:type="dxa"/>
+              <w:bottom w:w="95" w:type="dxa"/>
+              <w:right w:w="95" w:type="dxa"/>
+            </w:tcMar>
+            <w:shd w:fill="FFFFFF"/>
+          </w:tcPr>
+          <w:p>
+            <w:pPr>
+              <w:spacing w:after="40" w:line="260" w:lineRule="exact"/>
+              <w:snapToGrid w:val="0"/>
+            </w:pPr>
+            <w:r>
+              <w:rPr>
+                <w:b w:val="0"/>
+                <w:sz w:val="19"/>
+              </w:rPr>
+              <w:t>聊天显示只控制可见性。要检查实际内容，打开记忆管理；项目带入由项目记忆入口控制。</w:t>
+            </w:r>
+          </w:p>
+        </w:tc>
+      </w:tr>
+      <w:tr>
+        <w:trPr>
+          <w:cantSplit/>
+        </w:trPr>
+        <w:tc>
+          <w:tcPr>
+            <w:tcW w:type="dxa" w:w="2608"/>
+            <w:vAlign w:val="center"/>
+            <w:tcBorders>
+              <w:top w:val="single" w:sz="4" w:color="D9D9D9"/>
+              <w:left w:val="single" w:sz="4" w:color="D9D9D9"/>
+              <w:bottom w:val="single" w:sz="4" w:color="D9D9D9"/>
+              <w:right w:val="single" w:sz="4" w:color="D9D9D9"/>
+            </w:tcBorders>
+            <w:tcMar>
+              <w:top w:w="95" w:type="dxa"/>
+              <w:left w:w="95" w:type="dxa"/>
+              <w:bottom w:w="95" w:type="dxa"/>
+              <w:right w:w="95" w:type="dxa"/>
+            </w:tcMar>
+            <w:shd w:fill="F5F8FB"/>
+          </w:tcPr>
+          <w:p>
+            <w:pPr>
+              <w:spacing w:after="40" w:line="260" w:lineRule="exact"/>
+              <w:snapToGrid w:val="0"/>
+            </w:pPr>
+            <w:r>
+              <w:rPr>
+                <w:b w:val="0"/>
+                <w:sz w:val="19"/>
+              </w:rPr>
+              <w:t>旧会话或旧记忆未更新</w:t>
+            </w:r>
+          </w:p>
+        </w:tc>
+        <w:tc>
+          <w:tcPr>
+            <w:tcW w:type="dxa" w:w="7030"/>
+            <w:vAlign w:val="center"/>
+            <w:tcBorders>
+              <w:top w:val="single" w:sz="4" w:color="D9D9D9"/>
+              <w:left w:val="single" w:sz="4" w:color="D9D9D9"/>
+              <w:bottom w:val="single" w:sz="4" w:color="D9D9D9"/>
+              <w:right w:val="single" w:sz="4" w:color="D9D9D9"/>
+            </w:tcBorders>
+            <w:tcMar>
+              <w:top w:w="95" w:type="dxa"/>
+              <w:left w:w="95" w:type="dxa"/>
+              <w:bottom w:w="95" w:type="dxa"/>
+              <w:right w:w="95" w:type="dxa"/>
+            </w:tcMar>
+            <w:shd w:fill="F5F8FB"/>
+          </w:tcPr>
+          <w:p>
+            <w:pPr>
+              <w:spacing w:after="40" w:line="260" w:lineRule="exact"/>
+              <w:snapToGrid w:val="0"/>
+            </w:pPr>
+            <w:r>
+              <w:rPr>
+                <w:b w:val="0"/>
+                <w:sz w:val="19"/>
+              </w:rPr>
+              <w:t>加载更多会话，核对会话创建时间是否早于起始时间，等待历史同步和回答完成。</w:t>
+            </w:r>
+          </w:p>
+        </w:tc>
+      </w:tr>
+      <w:tr>
+        <w:trPr>
+          <w:cantSplit/>
+        </w:trPr>
+        <w:tc>
+          <w:tcPr>
+            <w:tcW w:type="dxa" w:w="2608"/>
+            <w:vAlign w:val="center"/>
+            <w:tcBorders>
+              <w:top w:val="single" w:sz="4" w:color="D9D9D9"/>
+              <w:left w:val="single" w:sz="4" w:color="D9D9D9"/>
+              <w:bottom w:val="single" w:sz="4" w:color="D9D9D9"/>
+              <w:right w:val="single" w:sz="4" w:color="D9D9D9"/>
+            </w:tcBorders>
+            <w:tcMar>
+              <w:top w:w="95" w:type="dxa"/>
+              <w:left w:w="95" w:type="dxa"/>
+              <w:bottom w:w="95" w:type="dxa"/>
+              <w:right w:w="95" w:type="dxa"/>
+            </w:tcMar>
+            <w:shd w:fill="FFFFFF"/>
+          </w:tcPr>
+          <w:p>
+            <w:pPr>
+              <w:spacing w:after="40" w:line="260" w:lineRule="exact"/>
+              <w:snapToGrid w:val="0"/>
+            </w:pPr>
+            <w:r>
+              <w:rPr>
+                <w:b w:val="0"/>
+                <w:sz w:val="19"/>
+              </w:rPr>
+              <w:t>记忆长时间不更新</w:t>
+            </w:r>
+          </w:p>
+        </w:tc>
+        <w:tc>
+          <w:tcPr>
+            <w:tcW w:type="dxa" w:w="7030"/>
+            <w:vAlign w:val="center"/>
+            <w:tcBorders>
+              <w:top w:val="single" w:sz="4" w:color="D9D9D9"/>
+              <w:left w:val="single" w:sz="4" w:color="D9D9D9"/>
+              <w:bottom w:val="single" w:sz="4" w:color="D9D9D9"/>
+              <w:right w:val="single" w:sz="4" w:color="D9D9D9"/>
+            </w:tcBorders>
+            <w:tcMar>
+              <w:top w:w="95" w:type="dxa"/>
+              <w:left w:w="95" w:type="dxa"/>
+              <w:bottom w:w="95" w:type="dxa"/>
+              <w:right w:w="95" w:type="dxa"/>
+            </w:tcMar>
+            <w:shd w:fill="FFFFFF"/>
+          </w:tcPr>
+          <w:p>
+            <w:pPr>
+              <w:spacing w:after="40" w:line="260" w:lineRule="exact"/>
+              <w:snapToGrid w:val="0"/>
+            </w:pPr>
+            <w:r>
+              <w:rPr>
+                <w:b w:val="0"/>
+                <w:sz w:val="19"/>
+              </w:rPr>
+              <w:t>检查队列暂停、超时或错误提示。刷新 DeepSeek 后再用对应范围“更新记忆”。</w:t>
+            </w:r>
+          </w:p>
+        </w:tc>
+      </w:tr>
+      <w:tr>
+        <w:trPr>
+          <w:cantSplit/>
+        </w:trPr>
+        <w:tc>
+          <w:tcPr>
+            <w:tcW w:type="dxa" w:w="2608"/>
+            <w:vAlign w:val="center"/>
+            <w:tcBorders>
+              <w:top w:val="single" w:sz="4" w:color="D9D9D9"/>
+              <w:left w:val="single" w:sz="4" w:color="D9D9D9"/>
+              <w:bottom w:val="single" w:sz="4" w:color="D9D9D9"/>
+              <w:right w:val="single" w:sz="4" w:color="D9D9D9"/>
+            </w:tcBorders>
+            <w:tcMar>
+              <w:top w:w="95" w:type="dxa"/>
+              <w:left w:w="95" w:type="dxa"/>
+              <w:bottom w:w="95" w:type="dxa"/>
+              <w:right w:w="95" w:type="dxa"/>
+            </w:tcMar>
+            <w:shd w:fill="F5F8FB"/>
+          </w:tcPr>
+          <w:p>
+            <w:pPr>
+              <w:spacing w:after="40" w:line="260" w:lineRule="exact"/>
+              <w:snapToGrid w:val="0"/>
+            </w:pPr>
+            <w:r>
+              <w:rPr>
+                <w:b w:val="0"/>
+                <w:sz w:val="19"/>
+              </w:rPr>
+              <w:t>个人记忆提示超预算</w:t>
+            </w:r>
+          </w:p>
+        </w:tc>
+        <w:tc>
+          <w:tcPr>
+            <w:tcW w:type="dxa" w:w="7030"/>
+            <w:vAlign w:val="center"/>
+            <w:tcBorders>
+              <w:top w:val="single" w:sz="4" w:color="D9D9D9"/>
+              <w:left w:val="single" w:sz="4" w:color="D9D9D9"/>
+              <w:bottom w:val="single" w:sz="4" w:color="D9D9D9"/>
+              <w:right w:val="single" w:sz="4" w:color="D9D9D9"/>
+            </w:tcBorders>
+            <w:tcMar>
+              <w:top w:w="95" w:type="dxa"/>
+              <w:left w:w="95" w:type="dxa"/>
+              <w:bottom w:w="95" w:type="dxa"/>
+              <w:right w:w="95" w:type="dxa"/>
+            </w:tcMar>
+            <w:shd w:fill="F5F8FB"/>
+          </w:tcPr>
+          <w:p>
+            <w:pPr>
+              <w:spacing w:after="40" w:line="260" w:lineRule="exact"/>
+              <w:snapToGrid w:val="0"/>
+            </w:pPr>
+            <w:r>
+              <w:rPr>
+                <w:b w:val="0"/>
+                <w:sz w:val="19"/>
+              </w:rPr>
+              <w:t>正文总预算 5000 字；到达上限会尝试压缩到约 4000 字。精简重复或低价值条目，固定内容过多也需手动处理。</w:t>
+            </w:r>
+          </w:p>
+        </w:tc>
+      </w:tr>
+      <w:tr>
+        <w:trPr>
+          <w:cantSplit/>
+        </w:trPr>
+        <w:tc>
+          <w:tcPr>
+            <w:tcW w:type="dxa" w:w="2608"/>
+            <w:vAlign w:val="center"/>
+            <w:tcBorders>
+              <w:top w:val="single" w:sz="4" w:color="D9D9D9"/>
+              <w:left w:val="single" w:sz="4" w:color="D9D9D9"/>
+              <w:bottom w:val="single" w:sz="4" w:color="D9D9D9"/>
+              <w:right w:val="single" w:sz="4" w:color="D9D9D9"/>
+            </w:tcBorders>
+            <w:tcMar>
+              <w:top w:w="95" w:type="dxa"/>
+              <w:left w:w="95" w:type="dxa"/>
+              <w:bottom w:w="95" w:type="dxa"/>
+              <w:right w:w="95" w:type="dxa"/>
+            </w:tcMar>
+            <w:shd w:fill="FFFFFF"/>
+          </w:tcPr>
+          <w:p>
+            <w:pPr>
+              <w:spacing w:after="40" w:line="260" w:lineRule="exact"/>
+              <w:snapToGrid w:val="0"/>
+            </w:pPr>
+            <w:r>
+              <w:rPr>
+                <w:b w:val="0"/>
+                <w:sz w:val="19"/>
+              </w:rPr>
+              <w:t>导入后项目条目没出现</w:t>
+            </w:r>
+          </w:p>
+        </w:tc>
+        <w:tc>
+          <w:tcPr>
+            <w:tcW w:type="dxa" w:w="7030"/>
+            <w:vAlign w:val="center"/>
+            <w:tcBorders>
+              <w:top w:val="single" w:sz="4" w:color="D9D9D9"/>
+              <w:left w:val="single" w:sz="4" w:color="D9D9D9"/>
+              <w:bottom w:val="single" w:sz="4" w:color="D9D9D9"/>
+              <w:right w:val="single" w:sz="4" w:color="D9D9D9"/>
+            </w:tcBorders>
+            <w:tcMar>
+              <w:top w:w="95" w:type="dxa"/>
+              <w:left w:w="95" w:type="dxa"/>
+              <w:bottom w:w="95" w:type="dxa"/>
+              <w:right w:w="95" w:type="dxa"/>
+            </w:tcMar>
+            <w:shd w:fill="FFFFFF"/>
+          </w:tcPr>
+          <w:p>
+            <w:pPr>
+              <w:spacing w:after="40" w:line="260" w:lineRule="exact"/>
+              <w:snapToGrid w:val="0"/>
+            </w:pPr>
+            <w:r>
+              <w:rPr>
+                <w:b w:val="0"/>
+                <w:sz w:val="19"/>
+              </w:rPr>
+              <w:t>确认预先建立同名项目，检查未映射项目数、重复 ID 和实际导入／跳过数量。</w:t>
+            </w:r>
+          </w:p>
+        </w:tc>
+      </w:tr>
+      <w:tr>
+        <w:trPr>
+          <w:cantSplit/>
+        </w:trPr>
+        <w:tc>
+          <w:tcPr>
+            <w:tcW w:type="dxa" w:w="2608"/>
+            <w:vAlign w:val="center"/>
+            <w:tcBorders>
+              <w:top w:val="single" w:sz="4" w:color="D9D9D9"/>
+              <w:left w:val="single" w:sz="4" w:color="D9D9D9"/>
+              <w:bottom w:val="single" w:sz="4" w:color="D9D9D9"/>
+              <w:right w:val="single" w:sz="4" w:color="D9D9D9"/>
+            </w:tcBorders>
+            <w:tcMar>
+              <w:top w:w="95" w:type="dxa"/>
+              <w:left w:w="95" w:type="dxa"/>
+              <w:bottom w:w="95" w:type="dxa"/>
+              <w:right w:w="95" w:type="dxa"/>
+            </w:tcMar>
+            <w:shd w:fill="F5F8FB"/>
+          </w:tcPr>
+          <w:p>
+            <w:pPr>
+              <w:spacing w:after="40" w:line="260" w:lineRule="exact"/>
+              <w:snapToGrid w:val="0"/>
+            </w:pPr>
+            <w:r>
+              <w:rPr>
+                <w:b w:val="0"/>
+                <w:sz w:val="19"/>
+              </w:rPr>
+              <w:t>新会话看到的背景不完整</w:t>
+            </w:r>
+          </w:p>
+        </w:tc>
+        <w:tc>
+          <w:tcPr>
+            <w:tcW w:type="dxa" w:w="7030"/>
+            <w:vAlign w:val="center"/>
+            <w:tcBorders>
+              <w:top w:val="single" w:sz="4" w:color="D9D9D9"/>
+              <w:left w:val="single" w:sz="4" w:color="D9D9D9"/>
+              <w:bottom w:val="single" w:sz="4" w:color="D9D9D9"/>
+              <w:right w:val="single" w:sz="4" w:color="D9D9D9"/>
+            </w:tcBorders>
+            <w:tcMar>
+              <w:top w:w="95" w:type="dxa"/>
+              <w:left w:w="95" w:type="dxa"/>
+              <w:bottom w:w="95" w:type="dxa"/>
+              <w:right w:w="95" w:type="dxa"/>
+            </w:tcMar>
+            <w:shd w:fill="F5F8FB"/>
+          </w:tcPr>
+          <w:p>
+            <w:pPr>
+              <w:spacing w:after="40" w:line="260" w:lineRule="exact"/>
+              <w:snapToGrid w:val="0"/>
+            </w:pPr>
+            <w:r>
+              <w:rPr>
+                <w:b w:val="0"/>
+                <w:sz w:val="19"/>
+              </w:rPr>
+              <w:t>核对条目是否生效、项目是否一致。带入有数量和文本预算，不保证每次发送全部记忆。</w:t>
+            </w:r>
+          </w:p>
+        </w:tc>
+      </w:tr>
+    </w:tbl>
+    <w:p>
+      <w:pPr>
+        <w:snapToGrid w:val="0"/>
+      </w:pPr>
+    </w:p>
+    <w:p>
+      <w:pPr>
+        <w:pStyle w:val="Heading2"/>
+        <w:snapToGrid w:val="0"/>
+      </w:pPr>
+      <w:r>
+        <w:t>数据保留与边界</w:t>
+      </w:r>
+    </w:p>
+    <w:p>
+      <w:pPr>
+        <w:snapToGrid w:val="0"/>
+      </w:pPr>
+      <w:r>
+        <w:t>侧边栏以 DeepSeek 当前返回的会话为准，本地历史缓存不会补回已删除聊天。项目归属按会话 ID 保存，尚未加载的会话仍可保留归属。插件按账号隔离本地数据，换账号时先确认记忆区域显示的数据账号。</w:t>
+      </w:r>
+    </w:p>
+    <w:p>
+      <w:pPr>
+        <w:snapToGrid w:val="0"/>
+      </w:pPr>
+      <w:r>
+        <w:t>本地会清理 30 天前的已完成作业、90 天前的耗时指标，以及已删除会话在 7 天后的消息和归属记录。DeepSeek Pilot 为独立第三方扩展，与 DeepSeek 官方无隶属关系。</w:t>
+      </w:r>
+    </w:p>
+    <w:p>
+      <w:pPr>
+        <w:snapToGrid w:val="0"/>
+      </w:pPr>
+      <w:r>
+        <w:br w:type="page"/>
+      </w:r>
+    </w:p>
+    <w:p>
+      <w:pPr>
+        <w:pStyle w:val="Heading1"/>
+        <w:snapToGrid w:val="0"/>
+      </w:pPr>
+      <w:r>
+        <w:t>附录 记忆架构的代码对应</w:t>
+      </w:r>
+    </w:p>
+    <w:p>
+      <w:pPr>
+        <w:snapToGrid w:val="0"/>
+      </w:pPr>
+      <w:r>
+        <w:t>图 1 展示当前实现的数据流。以下索引用于理解记忆从哪里来、何时保存以及何时带入，普通使用者无需修改这些文件。路径均相对仓库根目录。</w:t>
+      </w:r>
+    </w:p>
+    <w:tbl>
+      <w:tblPr>
+        <w:tblW w:type="auto" w:w="0"/>
+        <w:jc w:val="center"/>
+        <w:tblLayout w:type="fixed"/>
+        <w:tblLook w:firstColumn="1" w:firstRow="1" w:lastColumn="0" w:lastRow="0" w:noHBand="0" w:noVBand="1" w:val="04A0"/>
+      </w:tblPr>
+      <w:tblGrid>
+        <w:gridCol w:w="1871"/>
+        <w:gridCol w:w="3458"/>
+        <w:gridCol w:w="4309"/>
+      </w:tblGrid>
+      <w:tr>
+        <w:trPr>
+          <w:cantSplit/>
+          <w:tblHeader/>
+        </w:trPr>
+        <w:tc>
+          <w:tcPr>
+            <w:tcW w:type="dxa" w:w="1871"/>
+            <w:vAlign w:val="center"/>
+            <w:tcBorders>
+              <w:top w:val="single" w:sz="4" w:color="D9D9D9"/>
+              <w:left w:val="single" w:sz="4" w:color="D9D9D9"/>
+              <w:bottom w:val="single" w:sz="4" w:color="D9D9D9"/>
+              <w:right w:val="single" w:sz="4" w:color="D9D9D9"/>
+            </w:tcBorders>
+            <w:tcMar>
+              <w:top w:w="95" w:type="dxa"/>
+              <w:left w:w="95" w:type="dxa"/>
+              <w:bottom w:w="95" w:type="dxa"/>
+              <w:right w:w="95" w:type="dxa"/>
+            </w:tcMar>
+            <w:shd w:fill="DCE8F3"/>
+          </w:tcPr>
+          <w:p>
+            <w:pPr>
+              <w:spacing w:after="40" w:line="260" w:lineRule="exact"/>
+              <w:snapToGrid w:val="0"/>
+            </w:pPr>
+            <w:r>
+              <w:rPr>
+                <w:b/>
+                <w:sz w:val="19"/>
+              </w:rPr>
+              <w:t>架构环节</w:t>
+            </w:r>
+          </w:p>
+        </w:tc>
+        <w:tc>
+          <w:tcPr>
+            <w:tcW w:type="dxa" w:w="3458"/>
+            <w:vAlign w:val="center"/>
+            <w:tcBorders>
+              <w:top w:val="single" w:sz="4" w:color="D9D9D9"/>
+              <w:left w:val="single" w:sz="4" w:color="D9D9D9"/>
+              <w:bottom w:val="single" w:sz="4" w:color="D9D9D9"/>
+              <w:right w:val="single" w:sz="4" w:color="D9D9D9"/>
+            </w:tcBorders>
+            <w:tcMar>
+              <w:top w:w="95" w:type="dxa"/>
+              <w:left w:w="95" w:type="dxa"/>
+              <w:bottom w:w="95" w:type="dxa"/>
+              <w:right w:w="95" w:type="dxa"/>
+            </w:tcMar>
+            <w:shd w:fill="DCE8F3"/>
+          </w:tcPr>
+          <w:p>
+            <w:pPr>
+              <w:spacing w:after="40" w:line="260" w:lineRule="exact"/>
+              <w:snapToGrid w:val="0"/>
+            </w:pPr>
+            <w:r>
+              <w:rPr>
+                <w:b/>
+                <w:sz w:val="19"/>
+              </w:rPr>
+              <w:t>主要代码</w:t>
+            </w:r>
+          </w:p>
+        </w:tc>
+        <w:tc>
+          <w:tcPr>
+            <w:tcW w:type="dxa" w:w="4309"/>
+            <w:vAlign w:val="center"/>
+            <w:tcBorders>
+              <w:top w:val="single" w:sz="4" w:color="D9D9D9"/>
+              <w:left w:val="single" w:sz="4" w:color="D9D9D9"/>
+              <w:bottom w:val="single" w:sz="4" w:color="D9D9D9"/>
+              <w:right w:val="single" w:sz="4" w:color="D9D9D9"/>
+            </w:tcBorders>
+            <w:tcMar>
+              <w:top w:w="95" w:type="dxa"/>
+              <w:left w:w="95" w:type="dxa"/>
+              <w:bottom w:w="95" w:type="dxa"/>
+              <w:right w:w="95" w:type="dxa"/>
+            </w:tcMar>
+            <w:shd w:fill="DCE8F3"/>
+          </w:tcPr>
+          <w:p>
+            <w:pPr>
+              <w:spacing w:after="40" w:line="260" w:lineRule="exact"/>
+              <w:snapToGrid w:val="0"/>
+            </w:pPr>
+            <w:r>
+              <w:rPr>
+                <w:b/>
+                <w:sz w:val="19"/>
+              </w:rPr>
+              <w:t>实现要点</w:t>
+            </w:r>
+          </w:p>
+        </w:tc>
+      </w:tr>
+      <w:tr>
+        <w:trPr>
+          <w:cantSplit/>
+        </w:trPr>
+        <w:tc>
+          <w:tcPr>
+            <w:tcW w:type="dxa" w:w="1871"/>
+            <w:vAlign w:val="center"/>
+            <w:tcBorders>
+              <w:top w:val="single" w:sz="4" w:color="D9D9D9"/>
+              <w:left w:val="single" w:sz="4" w:color="D9D9D9"/>
+              <w:bottom w:val="single" w:sz="4" w:color="D9D9D9"/>
+              <w:right w:val="single" w:sz="4" w:color="D9D9D9"/>
+            </w:tcBorders>
+            <w:tcMar>
+              <w:top w:w="95" w:type="dxa"/>
+              <w:left w:w="95" w:type="dxa"/>
+              <w:bottom w:w="95" w:type="dxa"/>
+              <w:right w:w="95" w:type="dxa"/>
+            </w:tcMar>
+            <w:shd w:fill="FFFFFF"/>
+          </w:tcPr>
+          <w:p>
+            <w:pPr>
+              <w:spacing w:after="40" w:line="260" w:lineRule="exact"/>
+              <w:snapToGrid w:val="0"/>
+            </w:pPr>
+            <w:r>
+              <w:rPr>
+                <w:b w:val="0"/>
+                <w:sz w:val="19"/>
+              </w:rPr>
+              <w:t>页面同步与操作入口</w:t>
+            </w:r>
+          </w:p>
+        </w:tc>
+        <w:tc>
+          <w:tcPr>
+            <w:tcW w:type="dxa" w:w="3458"/>
+            <w:vAlign w:val="center"/>
+            <w:tcBorders>
+              <w:top w:val="single" w:sz="4" w:color="D9D9D9"/>
+              <w:left w:val="single" w:sz="4" w:color="D9D9D9"/>
+              <w:bottom w:val="single" w:sz="4" w:color="D9D9D9"/>
+              <w:right w:val="single" w:sz="4" w:color="D9D9D9"/>
+            </w:tcBorders>
+            <w:tcMar>
+              <w:top w:w="95" w:type="dxa"/>
+              <w:left w:w="95" w:type="dxa"/>
+              <w:bottom w:w="95" w:type="dxa"/>
+              <w:right w:w="95" w:type="dxa"/>
+            </w:tcMar>
+            <w:shd w:fill="FFFFFF"/>
+          </w:tcPr>
+          <w:p>
+            <w:pPr>
+              <w:spacing w:after="40" w:line="260" w:lineRule="exact"/>
+              <w:snapToGrid w:val="0"/>
+            </w:pPr>
+            <w:r>
+              <w:rPr>
+                <w:b w:val="0"/>
+                <w:sz w:val="19"/>
+              </w:rPr>
+              <w:t>core/content/workbench.js</w:t>
+              <w:br/>
+              <w:t>core/page/page-network.js</w:t>
+            </w:r>
+          </w:p>
+        </w:tc>
+        <w:tc>
+          <w:tcPr>
+            <w:tcW w:type="dxa" w:w="4309"/>
+            <w:vAlign w:val="center"/>
+            <w:tcBorders>
+              <w:top w:val="single" w:sz="4" w:color="D9D9D9"/>
+              <w:left w:val="single" w:sz="4" w:color="D9D9D9"/>
+              <w:bottom w:val="single" w:sz="4" w:color="D9D9D9"/>
+              <w:right w:val="single" w:sz="4" w:color="D9D9D9"/>
+            </w:tcBorders>
+            <w:tcMar>
+              <w:top w:w="95" w:type="dxa"/>
+              <w:left w:w="95" w:type="dxa"/>
+              <w:bottom w:w="95" w:type="dxa"/>
+              <w:right w:w="95" w:type="dxa"/>
+            </w:tcMar>
+            <w:shd w:fill="FFFFFF"/>
+          </w:tcPr>
+          <w:p>
+            <w:pPr>
+              <w:spacing w:after="40" w:line="260" w:lineRule="exact"/>
+              <w:snapToGrid w:val="0"/>
+            </w:pPr>
+            <w:r>
+              <w:rPr>
+                <w:b w:val="0"/>
+                <w:sz w:val="19"/>
+              </w:rPr>
+              <w:t>取得网页中的账号、会话列表和历史；提供项目、记忆开关、发送和辅助会话操作。</w:t>
+            </w:r>
+          </w:p>
+        </w:tc>
+      </w:tr>
+      <w:tr>
+        <w:trPr>
+          <w:cantSplit/>
+        </w:trPr>
+        <w:tc>
+          <w:tcPr>
+            <w:tcW w:type="dxa" w:w="1871"/>
+            <w:vAlign w:val="center"/>
+            <w:tcBorders>
+              <w:top w:val="single" w:sz="4" w:color="D9D9D9"/>
+              <w:left w:val="single" w:sz="4" w:color="D9D9D9"/>
+              <w:bottom w:val="single" w:sz="4" w:color="D9D9D9"/>
+              <w:right w:val="single" w:sz="4" w:color="D9D9D9"/>
+            </w:tcBorders>
+            <w:tcMar>
+              <w:top w:w="95" w:type="dxa"/>
+              <w:left w:w="95" w:type="dxa"/>
+              <w:bottom w:w="95" w:type="dxa"/>
+              <w:right w:w="95" w:type="dxa"/>
+            </w:tcMar>
+            <w:shd w:fill="F5F8FB"/>
+          </w:tcPr>
+          <w:p>
+            <w:pPr>
+              <w:spacing w:after="40" w:line="260" w:lineRule="exact"/>
+              <w:snapToGrid w:val="0"/>
+            </w:pPr>
+            <w:r>
+              <w:rPr>
+                <w:b w:val="0"/>
+                <w:sz w:val="19"/>
+              </w:rPr>
+              <w:t>完整会话的整理计划</w:t>
+            </w:r>
+          </w:p>
+        </w:tc>
+        <w:tc>
+          <w:tcPr>
+            <w:tcW w:type="dxa" w:w="3458"/>
+            <w:vAlign w:val="center"/>
+            <w:tcBorders>
+              <w:top w:val="single" w:sz="4" w:color="D9D9D9"/>
+              <w:left w:val="single" w:sz="4" w:color="D9D9D9"/>
+              <w:bottom w:val="single" w:sz="4" w:color="D9D9D9"/>
+              <w:right w:val="single" w:sz="4" w:color="D9D9D9"/>
+            </w:tcBorders>
+            <w:tcMar>
+              <w:top w:w="95" w:type="dxa"/>
+              <w:left w:w="95" w:type="dxa"/>
+              <w:bottom w:w="95" w:type="dxa"/>
+              <w:right w:w="95" w:type="dxa"/>
+            </w:tcMar>
+            <w:shd w:fill="F5F8FB"/>
+          </w:tcPr>
+          <w:p>
+            <w:pPr>
+              <w:spacing w:after="40" w:line="260" w:lineRule="exact"/>
+              <w:snapToGrid w:val="0"/>
+            </w:pPr>
+            <w:r>
+              <w:rPr>
+                <w:b w:val="0"/>
+                <w:sz w:val="19"/>
+              </w:rPr>
+              <w:t>core/background/session-memory.js</w:t>
+            </w:r>
+          </w:p>
+        </w:tc>
+        <w:tc>
+          <w:tcPr>
+            <w:tcW w:type="dxa" w:w="4309"/>
+            <w:vAlign w:val="center"/>
+            <w:tcBorders>
+              <w:top w:val="single" w:sz="4" w:color="D9D9D9"/>
+              <w:left w:val="single" w:sz="4" w:color="D9D9D9"/>
+              <w:bottom w:val="single" w:sz="4" w:color="D9D9D9"/>
+              <w:right w:val="single" w:sz="4" w:color="D9D9D9"/>
+            </w:tcBorders>
+            <w:tcMar>
+              <w:top w:w="95" w:type="dxa"/>
+              <w:left w:w="95" w:type="dxa"/>
+              <w:bottom w:w="95" w:type="dxa"/>
+              <w:right w:w="95" w:type="dxa"/>
+            </w:tcMar>
+            <w:shd w:fill="F5F8FB"/>
+          </w:tcPr>
+          <w:p>
+            <w:pPr>
+              <w:spacing w:after="40" w:line="260" w:lineRule="exact"/>
+              <w:snapToGrid w:val="0"/>
+            </w:pPr>
+            <w:r>
+              <w:rPr>
+                <w:b w:val="0"/>
+                <w:sz w:val="19"/>
+              </w:rPr>
+              <w:t>collectMemorySessions 与 enqueueMemorySessions 按会话指纹和个人／项目范围计划任务；项目会话可分别生成两类记忆。</w:t>
+            </w:r>
+          </w:p>
+        </w:tc>
+      </w:tr>
+      <w:tr>
+        <w:trPr>
+          <w:cantSplit/>
+        </w:trPr>
+        <w:tc>
+          <w:tcPr>
+            <w:tcW w:type="dxa" w:w="1871"/>
+            <w:vAlign w:val="center"/>
+            <w:tcBorders>
+              <w:top w:val="single" w:sz="4" w:color="D9D9D9"/>
+              <w:left w:val="single" w:sz="4" w:color="D9D9D9"/>
+              <w:bottom w:val="single" w:sz="4" w:color="D9D9D9"/>
+              <w:right w:val="single" w:sz="4" w:color="D9D9D9"/>
+            </w:tcBorders>
+            <w:tcMar>
+              <w:top w:w="95" w:type="dxa"/>
+              <w:left w:w="95" w:type="dxa"/>
+              <w:bottom w:w="95" w:type="dxa"/>
+              <w:right w:w="95" w:type="dxa"/>
+            </w:tcMar>
+            <w:shd w:fill="FFFFFF"/>
+          </w:tcPr>
+          <w:p>
+            <w:pPr>
+              <w:spacing w:after="40" w:line="260" w:lineRule="exact"/>
+              <w:snapToGrid w:val="0"/>
+            </w:pPr>
+            <w:r>
+              <w:rPr>
+                <w:b w:val="0"/>
+                <w:sz w:val="19"/>
+              </w:rPr>
+              <w:t>队列与记忆校验</w:t>
+            </w:r>
+          </w:p>
+        </w:tc>
+        <w:tc>
+          <w:tcPr>
+            <w:tcW w:type="dxa" w:w="3458"/>
+            <w:vAlign w:val="center"/>
+            <w:tcBorders>
+              <w:top w:val="single" w:sz="4" w:color="D9D9D9"/>
+              <w:left w:val="single" w:sz="4" w:color="D9D9D9"/>
+              <w:bottom w:val="single" w:sz="4" w:color="D9D9D9"/>
+              <w:right w:val="single" w:sz="4" w:color="D9D9D9"/>
+            </w:tcBorders>
+            <w:tcMar>
+              <w:top w:w="95" w:type="dxa"/>
+              <w:left w:w="95" w:type="dxa"/>
+              <w:bottom w:w="95" w:type="dxa"/>
+              <w:right w:w="95" w:type="dxa"/>
+            </w:tcMar>
+            <w:shd w:fill="FFFFFF"/>
+          </w:tcPr>
+          <w:p>
+            <w:pPr>
+              <w:spacing w:after="40" w:line="260" w:lineRule="exact"/>
+              <w:snapToGrid w:val="0"/>
+            </w:pPr>
+            <w:r>
+              <w:rPr>
+                <w:b w:val="0"/>
+                <w:sz w:val="19"/>
+              </w:rPr>
+              <w:t>core/background/workbench.js</w:t>
+              <w:br/>
+              <w:t>core/background/session-memory.js</w:t>
+            </w:r>
+          </w:p>
+        </w:tc>
+        <w:tc>
+          <w:tcPr>
+            <w:tcW w:type="dxa" w:w="4309"/>
+            <w:vAlign w:val="center"/>
+            <w:tcBorders>
+              <w:top w:val="single" w:sz="4" w:color="D9D9D9"/>
+              <w:left w:val="single" w:sz="4" w:color="D9D9D9"/>
+              <w:bottom w:val="single" w:sz="4" w:color="D9D9D9"/>
+              <w:right w:val="single" w:sz="4" w:color="D9D9D9"/>
+            </w:tcBorders>
+            <w:tcMar>
+              <w:top w:w="95" w:type="dxa"/>
+              <w:left w:w="95" w:type="dxa"/>
+              <w:bottom w:w="95" w:type="dxa"/>
+              <w:right w:w="95" w:type="dxa"/>
+            </w:tcMar>
+            <w:shd w:fill="FFFFFF"/>
+          </w:tcPr>
+          <w:p>
+            <w:pPr>
+              <w:spacing w:after="40" w:line="260" w:lineRule="exact"/>
+              <w:snapToGrid w:val="0"/>
+            </w:pPr>
+            <w:r>
+              <w:rPr>
+                <w:b w:val="0"/>
+                <w:sz w:val="19"/>
+              </w:rPr>
+              <w:t>串行调度辅助会话，核对来源、版本、记忆快照与输出；成功才提交，过期结果不覆盖新状态。</w:t>
+            </w:r>
+          </w:p>
+        </w:tc>
+      </w:tr>
+      <w:tr>
+        <w:trPr>
+          <w:cantSplit/>
+        </w:trPr>
+        <w:tc>
+          <w:tcPr>
+            <w:tcW w:type="dxa" w:w="1871"/>
+            <w:vAlign w:val="center"/>
+            <w:tcBorders>
+              <w:top w:val="single" w:sz="4" w:color="D9D9D9"/>
+              <w:left w:val="single" w:sz="4" w:color="D9D9D9"/>
+              <w:bottom w:val="single" w:sz="4" w:color="D9D9D9"/>
+              <w:right w:val="single" w:sz="4" w:color="D9D9D9"/>
+            </w:tcBorders>
+            <w:tcMar>
+              <w:top w:w="95" w:type="dxa"/>
+              <w:left w:w="95" w:type="dxa"/>
+              <w:bottom w:w="95" w:type="dxa"/>
+              <w:right w:w="95" w:type="dxa"/>
+            </w:tcMar>
+            <w:shd w:fill="F5F8FB"/>
+          </w:tcPr>
+          <w:p>
+            <w:pPr>
+              <w:spacing w:after="40" w:line="260" w:lineRule="exact"/>
+              <w:snapToGrid w:val="0"/>
+            </w:pPr>
+            <w:r>
+              <w:rPr>
+                <w:b w:val="0"/>
+                <w:sz w:val="19"/>
+              </w:rPr>
+              <w:t>本地存储与保护</w:t>
+            </w:r>
+          </w:p>
+        </w:tc>
+        <w:tc>
+          <w:tcPr>
+            <w:tcW w:type="dxa" w:w="3458"/>
+            <w:vAlign w:val="center"/>
+            <w:tcBorders>
+              <w:top w:val="single" w:sz="4" w:color="D9D9D9"/>
+              <w:left w:val="single" w:sz="4" w:color="D9D9D9"/>
+              <w:bottom w:val="single" w:sz="4" w:color="D9D9D9"/>
+              <w:right w:val="single" w:sz="4" w:color="D9D9D9"/>
+            </w:tcBorders>
+            <w:tcMar>
+              <w:top w:w="95" w:type="dxa"/>
+              <w:left w:w="95" w:type="dxa"/>
+              <w:bottom w:w="95" w:type="dxa"/>
+              <w:right w:w="95" w:type="dxa"/>
+            </w:tcMar>
+            <w:shd w:fill="F5F8FB"/>
+          </w:tcPr>
+          <w:p>
+            <w:pPr>
+              <w:spacing w:after="40" w:line="260" w:lineRule="exact"/>
+              <w:snapToGrid w:val="0"/>
+            </w:pPr>
+            <w:r>
+              <w:rPr>
+                <w:b w:val="0"/>
+                <w:sz w:val="19"/>
+              </w:rPr>
+              <w:t>core/logic/db.js</w:t>
+            </w:r>
+          </w:p>
+        </w:tc>
+        <w:tc>
+          <w:tcPr>
+            <w:tcW w:type="dxa" w:w="4309"/>
+            <w:vAlign w:val="center"/>
+            <w:tcBorders>
+              <w:top w:val="single" w:sz="4" w:color="D9D9D9"/>
+              <w:left w:val="single" w:sz="4" w:color="D9D9D9"/>
+              <w:bottom w:val="single" w:sz="4" w:color="D9D9D9"/>
+              <w:right w:val="single" w:sz="4" w:color="D9D9D9"/>
+            </w:tcBorders>
+            <w:tcMar>
+              <w:top w:w="95" w:type="dxa"/>
+              <w:left w:w="95" w:type="dxa"/>
+              <w:bottom w:w="95" w:type="dxa"/>
+              <w:right w:w="95" w:type="dxa"/>
+            </w:tcMar>
+            <w:shd w:fill="F5F8FB"/>
+          </w:tcPr>
+          <w:p>
+            <w:pPr>
+              <w:spacing w:after="40" w:line="260" w:lineRule="exact"/>
+              <w:snapToGrid w:val="0"/>
+            </w:pPr>
+            <w:r>
+              <w:rPr>
+                <w:b w:val="0"/>
+                <w:sz w:val="19"/>
+              </w:rPr>
+              <w:t>IndexedDB 库 deepseek-task-workbench。memories 保存记忆，memoryTurns 记录处理版本，memoryHistory 保存快照及主动删除记录。</w:t>
+            </w:r>
+          </w:p>
+        </w:tc>
+      </w:tr>
+      <w:tr>
+        <w:trPr>
+          <w:cantSplit/>
+        </w:trPr>
+        <w:tc>
+          <w:tcPr>
+            <w:tcW w:type="dxa" w:w="1871"/>
+            <w:vAlign w:val="center"/>
+            <w:tcBorders>
+              <w:top w:val="single" w:sz="4" w:color="D9D9D9"/>
+              <w:left w:val="single" w:sz="4" w:color="D9D9D9"/>
+              <w:bottom w:val="single" w:sz="4" w:color="D9D9D9"/>
+              <w:right w:val="single" w:sz="4" w:color="D9D9D9"/>
+            </w:tcBorders>
+            <w:tcMar>
+              <w:top w:w="95" w:type="dxa"/>
+              <w:left w:w="95" w:type="dxa"/>
+              <w:bottom w:w="95" w:type="dxa"/>
+              <w:right w:w="95" w:type="dxa"/>
+            </w:tcMar>
+            <w:shd w:fill="FFFFFF"/>
+          </w:tcPr>
+          <w:p>
+            <w:pPr>
+              <w:spacing w:after="40" w:line="260" w:lineRule="exact"/>
+              <w:snapToGrid w:val="0"/>
+            </w:pPr>
+            <w:r>
+              <w:rPr>
+                <w:b w:val="0"/>
+                <w:sz w:val="19"/>
+              </w:rPr>
+              <w:t>首条带入与接续</w:t>
+            </w:r>
+          </w:p>
+        </w:tc>
+        <w:tc>
+          <w:tcPr>
+            <w:tcW w:type="dxa" w:w="3458"/>
+            <w:vAlign w:val="center"/>
+            <w:tcBorders>
+              <w:top w:val="single" w:sz="4" w:color="D9D9D9"/>
+              <w:left w:val="single" w:sz="4" w:color="D9D9D9"/>
+              <w:bottom w:val="single" w:sz="4" w:color="D9D9D9"/>
+              <w:right w:val="single" w:sz="4" w:color="D9D9D9"/>
+            </w:tcBorders>
+            <w:tcMar>
+              <w:top w:w="95" w:type="dxa"/>
+              <w:left w:w="95" w:type="dxa"/>
+              <w:bottom w:w="95" w:type="dxa"/>
+              <w:right w:w="95" w:type="dxa"/>
+            </w:tcMar>
+            <w:shd w:fill="FFFFFF"/>
+          </w:tcPr>
+          <w:p>
+            <w:pPr>
+              <w:spacing w:after="40" w:line="260" w:lineRule="exact"/>
+              <w:snapToGrid w:val="0"/>
+            </w:pPr>
+            <w:r>
+              <w:rPr>
+                <w:b w:val="0"/>
+                <w:sz w:val="19"/>
+              </w:rPr>
+              <w:t>core/background/workbench.js</w:t>
+            </w:r>
+          </w:p>
+        </w:tc>
+        <w:tc>
+          <w:tcPr>
+            <w:tcW w:type="dxa" w:w="4309"/>
+            <w:vAlign w:val="center"/>
+            <w:tcBorders>
+              <w:top w:val="single" w:sz="4" w:color="D9D9D9"/>
+              <w:left w:val="single" w:sz="4" w:color="D9D9D9"/>
+              <w:bottom w:val="single" w:sz="4" w:color="D9D9D9"/>
+              <w:right w:val="single" w:sz="4" w:color="D9D9D9"/>
+            </w:tcBorders>
+            <w:tcMar>
+              <w:top w:w="95" w:type="dxa"/>
+              <w:left w:w="95" w:type="dxa"/>
+              <w:bottom w:w="95" w:type="dxa"/>
+              <w:right w:w="95" w:type="dxa"/>
+            </w:tcMar>
+            <w:shd w:fill="FFFFFF"/>
+          </w:tcPr>
+          <w:p>
+            <w:pPr>
+              <w:spacing w:after="40" w:line="260" w:lineRule="exact"/>
+              <w:snapToGrid w:val="0"/>
+            </w:pPr>
+            <w:r>
+              <w:rPr>
+                <w:b w:val="0"/>
+                <w:sz w:val="19"/>
+              </w:rPr>
+              <w:t>sendMemoryBlock 选取生效条目；prepareSend 判断首条与接续。个人优先、固定优先，最多选 45 条，条目文本预算 12000 字符。</w:t>
+            </w:r>
+          </w:p>
+        </w:tc>
+      </w:tr>
+      <w:tr>
+        <w:trPr>
+          <w:cantSplit/>
+        </w:trPr>
+        <w:tc>
+          <w:tcPr>
+            <w:tcW w:type="dxa" w:w="1871"/>
+            <w:vAlign w:val="center"/>
+            <w:tcBorders>
+              <w:top w:val="single" w:sz="4" w:color="D9D9D9"/>
+              <w:left w:val="single" w:sz="4" w:color="D9D9D9"/>
+              <w:bottom w:val="single" w:sz="4" w:color="D9D9D9"/>
+              <w:right w:val="single" w:sz="4" w:color="D9D9D9"/>
+            </w:tcBorders>
+            <w:tcMar>
+              <w:top w:w="95" w:type="dxa"/>
+              <w:left w:w="95" w:type="dxa"/>
+              <w:bottom w:w="95" w:type="dxa"/>
+              <w:right w:w="95" w:type="dxa"/>
+            </w:tcMar>
+            <w:shd w:fill="F5F8FB"/>
+          </w:tcPr>
+          <w:p>
+            <w:pPr>
+              <w:spacing w:after="40" w:line="260" w:lineRule="exact"/>
+              <w:snapToGrid w:val="0"/>
+            </w:pPr>
+            <w:r>
+              <w:rPr>
+                <w:b w:val="0"/>
+                <w:sz w:val="19"/>
+              </w:rPr>
+              <w:t>管理与显示</w:t>
+            </w:r>
+          </w:p>
+        </w:tc>
+        <w:tc>
+          <w:tcPr>
+            <w:tcW w:type="dxa" w:w="3458"/>
+            <w:vAlign w:val="center"/>
+            <w:tcBorders>
+              <w:top w:val="single" w:sz="4" w:color="D9D9D9"/>
+              <w:left w:val="single" w:sz="4" w:color="D9D9D9"/>
+              <w:bottom w:val="single" w:sz="4" w:color="D9D9D9"/>
+              <w:right w:val="single" w:sz="4" w:color="D9D9D9"/>
+            </w:tcBorders>
+            <w:tcMar>
+              <w:top w:w="95" w:type="dxa"/>
+              <w:left w:w="95" w:type="dxa"/>
+              <w:bottom w:w="95" w:type="dxa"/>
+              <w:right w:w="95" w:type="dxa"/>
+            </w:tcMar>
+            <w:shd w:fill="F5F8FB"/>
+          </w:tcPr>
+          <w:p>
+            <w:pPr>
+              <w:spacing w:after="40" w:line="260" w:lineRule="exact"/>
+              <w:snapToGrid w:val="0"/>
+            </w:pPr>
+            <w:r>
+              <w:rPr>
+                <w:b w:val="0"/>
+                <w:sz w:val="19"/>
+              </w:rPr>
+              <w:t>core/options/options.html</w:t>
+              <w:br/>
+              <w:t>core/options/options.js</w:t>
+              <w:br/>
+              <w:t>core/manage/manage.js</w:t>
+              <w:br/>
+              <w:t>core/logic/memory-display.js</w:t>
+            </w:r>
+          </w:p>
+        </w:tc>
+        <w:tc>
+          <w:tcPr>
+            <w:tcW w:type="dxa" w:w="4309"/>
+            <w:vAlign w:val="center"/>
+            <w:tcBorders>
+              <w:top w:val="single" w:sz="4" w:color="D9D9D9"/>
+              <w:left w:val="single" w:sz="4" w:color="D9D9D9"/>
+              <w:bottom w:val="single" w:sz="4" w:color="D9D9D9"/>
+              <w:right w:val="single" w:sz="4" w:color="D9D9D9"/>
+            </w:tcBorders>
+            <w:tcMar>
+              <w:top w:w="95" w:type="dxa"/>
+              <w:left w:w="95" w:type="dxa"/>
+              <w:bottom w:w="95" w:type="dxa"/>
+              <w:right w:w="95" w:type="dxa"/>
+            </w:tcMar>
+            <w:shd w:fill="F5F8FB"/>
+          </w:tcPr>
+          <w:p>
+            <w:pPr>
+              <w:spacing w:after="40" w:line="260" w:lineRule="exact"/>
+              <w:snapToGrid w:val="0"/>
+            </w:pPr>
+            <w:r>
+              <w:rPr>
+                <w:b w:val="0"/>
+                <w:sz w:val="19"/>
+              </w:rPr>
+              <w:t>设置预算和可见性；查看、编辑、固定、删除及导入导出；显示开关与学习流程分别控制。</w:t>
+            </w:r>
+          </w:p>
+        </w:tc>
+      </w:tr>
+    </w:tbl>
+    <w:p>
+      <w:pPr>
+        <w:snapToGrid w:val="0"/>
+      </w:pPr>
+    </w:p>
+    <w:p>
+      <w:pPr>
+        <w:pStyle w:val="Heading2"/>
+        <w:snapToGrid w:val="0"/>
+      </w:pPr>
+      <w:r>
+        <w:t>关键机制补充</w:t>
+      </w:r>
+    </w:p>
+    <w:p>
+      <w:pPr>
+        <w:snapToGrid w:val="0"/>
+      </w:pPr>
+      <w:r>
+        <w:t>记忆整理读取的是所选完整会话及当前保存的对应范围记忆，按新增、修改、合并、删除或保持不变输出完整列表；不是每轮机械追加一条摘要。固定条目在自动整理中必须原样保留。</w:t>
+      </w:r>
+    </w:p>
+    <w:p>
+      <w:pPr>
+        <w:snapToGrid w:val="0"/>
+      </w:pPr>
+      <w:r>
+        <w:t>个人记忆上限按正文 Unicode 字符计算，不按 token 计算。首次带入还受独立选择预算约束，所以本地存储条数与本轮带入条数不必相同。项目目标也会进入项目背景。</w:t>
+      </w:r>
+    </w:p>
+    <w:p>
+      <w:pPr>
+        <w:snapToGrid w:val="0"/>
+      </w:pPr>
+      <w:r>
+        <w:t>Firefox 的对应代码位于 firefox 目录。两种浏览器共享相同功能思路，但各自保存本地数据，迁移请使用第六节的导入导出。</w:t>
+      </w:r>
+    </w:p>
+    <w:p>
+      <w:pPr>
+        <w:pStyle w:val="Heading2"/>
+        <w:snapToGrid w:val="0"/>
+      </w:pPr>
+      <w:r>
+        <w:t>截图说明</w:t>
+      </w:r>
+    </w:p>
+    <w:p>
+      <w:pPr>
+        <w:snapToGrid w:val="0"/>
+      </w:pPr>
+      <w:r>
+        <w:t>本教程使用项目 docs/截图 文件夹内提供的使用截图，按操作环节裁剪；账号与个人资料正文按需遮盖。红框和箭头来自原截图。截图中的项目、开关和记忆内容是当时状态，功能规则以正文说明为准。</w:t>
       </w:r>
     </w:p>
     <w:sectPr>
-      <w:headerReference w:type="default" r:id="rId9"/>
-      <w:footerReference w:type="default" r:id="rId10"/>
+      <w:footerReference w:type="default" r:id="rId9"/>
       <w:pgSz w:w="11906" w:h="16838"/>
-      <w:pgMar w:top="964" w:right="1134" w:bottom="964" w:left="1134" w:header="720" w:footer="720" w:gutter="0"/>
+      <w:pgMar w:top="935" w:right="1134" w:bottom="907" w:left="1134" w:header="720" w:footer="397" w:gutter="0"/>
       <w:cols w:space="720"/>
       <w:docGrid w:linePitch="360"/>
     </w:sectPr>
@@ -691,30 +4023,17 @@
   <w:p>
     <w:pPr>
       <w:pStyle w:val="Footer"/>
-      <w:jc w:val="right"/>
+      <w:jc w:val="center"/>
     </w:pPr>
     <w:r>
-      <w:t xml:space="preserve">第 </w:t>
+      <w:rPr>
+        <w:sz w:val="16"/>
+      </w:rPr>
+      <w:t xml:space="preserve">DeepSeek Pilot  ·  </w:t>
     </w:r>
     <w:fldSimple w:instr="PAGE"/>
-    <w:r>
-      <w:t xml:space="preserve"> 页</w:t>
-    </w:r>
   </w:p>
 </w:ftr>
-</file>
-
-<file path=word/header1.xml><?xml version="1.0" encoding="utf-8"?>
-<w:hdr xmlns:m="http://schemas.openxmlformats.org/officeDocument/2006/math" xmlns:mc="http://schemas.openxmlformats.org/markup-compatibility/2006" xmlns:mo="http://schemas.microsoft.com/office/mac/office/2008/main" xmlns:mv="urn:schemas-microsoft-com:mac:vml" xmlns:o="urn:schemas-microsoft-com:office:office" xmlns:r="http://schemas.openxmlformats.org/officeDocument/2006/relationships" xmlns:v="urn:schemas-microsoft-com:vml" xmlns:w10="urn:schemas-microsoft-com:office:word" xmlns:w14="http://schemas.microsoft.com/office/word/2010/wordml" xmlns:w="http://schemas.openxmlformats.org/wordprocessingml/2006/main" xmlns:wne="http://schemas.microsoft.com/office/word/2006/wordml" xmlns:wp14="http://schemas.microsoft.com/office/word/2010/wordprocessingDrawing" xmlns:wp="http://schemas.openxmlformats.org/drawingml/2006/wordprocessingDrawing" xmlns:wpc="http://schemas.microsoft.com/office/word/2010/wordprocessingCanvas" xmlns:wpg="http://schemas.microsoft.com/office/word/2010/wordprocessingGroup" xmlns:wpi="http://schemas.microsoft.com/office/word/2010/wordprocessingInk" xmlns:wps="http://schemas.microsoft.com/office/word/2010/wordprocessingShape" mc:Ignorable="w14 wp14">
-  <w:p>
-    <w:pPr>
-      <w:pStyle w:val="Caption"/>
-    </w:pPr>
-    <w:r>
-      <w:t>DeepSeek Pilot  使用教程</w:t>
-    </w:r>
-  </w:p>
-</w:hdr>
 </file>
 
 <file path=word/numbering.xml><?xml version="1.0" encoding="utf-8"?>
@@ -1081,10 +4400,12 @@
     <w:qFormat/>
     <w:rsid w:val="00FC693F"/>
     <w:pPr>
-      <w:spacing w:after="100" w:line="259" w:lineRule="auto"/>
+      <w:spacing w:after="100" w:line="300" w:lineRule="exact"/>
+      <w:snapToGrid w:val="0"/>
     </w:pPr>
     <w:rPr>
       <w:rFonts w:ascii="Microsoft YaHei" w:hAnsi="Microsoft YaHei" w:eastAsia="Microsoft YaHei"/>
+      <w:i w:val="0"/>
       <w:color w:val="000000"/>
       <w:sz w:val="21"/>
     </w:rPr>
@@ -1144,13 +4465,15 @@
     <w:pPr>
       <w:keepNext/>
       <w:keepLines/>
-      <w:spacing w:before="480" w:after="0"/>
+      <w:spacing w:before="480" w:after="240"/>
       <w:outlineLvl w:val="0"/>
+      <w:snapToGrid w:val="0"/>
     </w:pPr>
     <w:rPr>
       <w:rFonts w:asciiTheme="majorHAnsi" w:eastAsiaTheme="majorEastAsia" w:hAnsiTheme="majorHAnsi" w:cstheme="majorBidi" w:ascii="Microsoft YaHei" w:hAnsi="Microsoft YaHei" w:eastAsia="Microsoft YaHei"/>
       <w:b/>
       <w:bCs/>
+      <w:i w:val="0"/>
       <w:color w:val="000000"/>
       <w:sz w:val="38"/>
       <w:szCs w:val="28"/>
@@ -1168,13 +4491,15 @@
     <w:pPr>
       <w:keepNext/>
       <w:keepLines/>
-      <w:spacing w:before="200" w:after="0"/>
+      <w:spacing w:before="200" w:after="100"/>
       <w:outlineLvl w:val="1"/>
+      <w:snapToGrid w:val="0"/>
     </w:pPr>
     <w:rPr>
       <w:rFonts w:asciiTheme="majorHAnsi" w:eastAsiaTheme="majorEastAsia" w:hAnsiTheme="majorHAnsi" w:cstheme="majorBidi" w:ascii="Microsoft YaHei" w:hAnsi="Microsoft YaHei" w:eastAsia="Microsoft YaHei"/>
       <w:b/>
       <w:bCs/>
+      <w:i w:val="0"/>
       <w:color w:val="000000"/>
       <w:sz w:val="24"/>
       <w:szCs w:val="26"/>
@@ -1430,15 +4755,18 @@
     <w:qFormat/>
     <w:rsid w:val="00FC693F"/>
     <w:pPr>
-      <w:spacing w:after="300" w:line="240" w:lineRule="auto"/>
+      <w:spacing w:after="100" w:line="240" w:lineRule="auto"/>
       <w:contextualSpacing/>
+      <w:snapToGrid w:val="0"/>
     </w:pPr>
     <w:rPr>
       <w:rFonts w:asciiTheme="majorHAnsi" w:eastAsiaTheme="majorEastAsia" w:hAnsiTheme="majorHAnsi" w:cstheme="majorBidi" w:ascii="Microsoft YaHei" w:hAnsi="Microsoft YaHei" w:eastAsia="Microsoft YaHei"/>
+      <w:b/>
+      <w:i w:val="0"/>
       <w:color w:val="000000"/>
       <w:spacing w:val="5"/>
       <w:kern w:val="28"/>
-      <w:sz w:val="50"/>
+      <w:sz w:val="48"/>
       <w:szCs w:val="52"/>
     </w:rPr>
   </w:style>
@@ -1469,14 +4797,16 @@
       <w:numPr>
         <w:ilvl w:val="1"/>
       </w:numPr>
+      <w:spacing w:after="100"/>
+      <w:snapToGrid w:val="0"/>
     </w:pPr>
     <w:rPr>
       <w:rFonts w:asciiTheme="majorHAnsi" w:eastAsiaTheme="majorEastAsia" w:hAnsiTheme="majorHAnsi" w:cstheme="majorBidi" w:ascii="Microsoft YaHei" w:hAnsi="Microsoft YaHei" w:eastAsia="Microsoft YaHei"/>
-      <w:i/>
+      <w:i w:val="0"/>
       <w:iCs/>
       <w:color w:val="000000"/>
       <w:spacing w:val="15"/>
-      <w:sz w:val="24"/>
+      <w:sz w:val="22"/>
       <w:szCs w:val="24"/>
     </w:rPr>
   </w:style>
@@ -1873,13 +5203,15 @@
     <w:qFormat/>
     <w:rsid w:val="00FC693F"/>
     <w:pPr>
-      <w:spacing w:line="240" w:lineRule="auto"/>
+      <w:spacing w:line="240" w:lineRule="auto" w:after="100"/>
+      <w:snapToGrid w:val="0"/>
     </w:pPr>
     <w:rPr>
       <w:rFonts w:ascii="Microsoft YaHei" w:hAnsi="Microsoft YaHei" w:eastAsia="Microsoft YaHei"/>
       <w:b/>
       <w:bCs/>
-      <w:color w:val="000000"/>
+      <w:i w:val="0"/>
+      <w:color w:val="555555"/>
       <w:sz w:val="18"/>
       <w:szCs w:val="18"/>
     </w:rPr>
@@ -1915,6 +5247,9 @@
     <w:qFormat/>
     <w:rsid w:val="00FC693F"/>
     <w:pPr>
+      <w:pBdr>
+        <w:bottom w:val="single" w:sz="4" w:space="4" w:color="4F81BD" w:themeColor="accent1"/>
+      </w:pBdr>
       <w:spacing w:before="200" w:after="280"/>
       <w:ind w:left="936" w:right="936"/>
     </w:pPr>

</xml_diff>

<commit_message>
docs: link Firefox installation directly to DeepSeek Pilot add-on
Replace the add-on search step with the supplied direct installation hyperlink and renumber the remaining steps. Verify seven-page layout, single-line instructions, the exact hyperlink target, and unchanged screenshot bytes.
</commit_message>
<xml_diff>
--- a/tutorial/DeepSeek-Pilot使用教程.docx
+++ b/tutorial/DeepSeek-Pilot使用教程.docx
@@ -196,7 +196,21 @@
         <w:keepLines/>
       </w:pPr>
       <w:r>
-        <w:t>1. 访问 https://addons.mozilla.org/zh-CN/firefox/ 。</w:t>
+        <w:t>1. 访问</w:t>
+      </w:r>
+      <w:hyperlink r:id="rId17">
+        <w:r>
+          <w:rPr>
+            <w:rFonts w:ascii="Times New Roman" w:hAnsi="Times New Roman" w:eastAsia="宋体"/>
+            <w:sz w:val="24"/>
+            <w:color w:val="0563C1"/>
+            <w:u w:val="single"/>
+          </w:rPr>
+          <w:t>DeepSeek Pilot 安装页面</w:t>
+        </w:r>
+      </w:hyperlink>
+      <w:r>
+        <w:t>。</w:t>
       </w:r>
     </w:p>
     <w:p>
@@ -204,7 +218,7 @@
         <w:keepLines/>
       </w:pPr>
       <w:r>
-        <w:t>2. 搜索并打开 DeepSeek Pilot 的扩展页面。</w:t>
+        <w:t>2. 点击“添加到 Firefox”并确认安装权限。</w:t>
       </w:r>
     </w:p>
     <w:p>
@@ -212,7 +226,7 @@
         <w:keepLines/>
       </w:pPr>
       <w:r>
-        <w:t>3. 点击“添加到 Firefox”并确认安装权限。</w:t>
+        <w:t>3. 打开 DeepSeek 并登录账号。</w:t>
       </w:r>
     </w:p>
     <w:p>
@@ -220,15 +234,7 @@
         <w:keepLines/>
       </w:pPr>
       <w:r>
-        <w:t>4. 打开 DeepSeek 并登录账号。</w:t>
-      </w:r>
-    </w:p>
-    <w:p>
-      <w:pPr>
-        <w:keepLines/>
-      </w:pPr>
-      <w:r>
-        <w:t>5. 刷新网页后确认左侧出现项目区域。</w:t>
+        <w:t>4. 刷新网页后确认左侧出现项目区域。</w:t>
       </w:r>
     </w:p>
     <w:p>

</xml_diff>